<commit_message>
feat: sync CV v2 assets, update copywriting, optimize SEO/GEO/AEO schemas, and refine UI/UX motion
</commit_message>
<xml_diff>
--- a/public/Andry_Huang_CV.docx
+++ b/public/Andry_Huang_CV.docx
@@ -8,81 +8,134 @@
         <w:jc w:val="center"/>
         <w:tblLayout w:type="fixed"/>
         <w:tblLook w:firstColumn="1" w:firstRow="1" w:lastColumn="0" w:lastRow="0" w:noHBand="0" w:noVBand="1" w:val="04A0"/>
+        <w:tblBorders>
+          <w:top w:val="none"/>
+          <w:left w:val="none"/>
+          <w:bottom w:val="single" w:sz="12" w:space="0" w:color="1E3A8A"/>
+          <w:right w:val="none"/>
+          <w:insideH w:val="none"/>
+          <w:insideV w:val="none"/>
+        </w:tblBorders>
       </w:tblPr>
       <w:tblGrid>
-        <w:gridCol w:w="5544"/>
-        <w:gridCol w:w="5544"/>
+        <w:gridCol w:w="5256"/>
+        <w:gridCol w:w="5256"/>
       </w:tblGrid>
       <w:tr>
         <w:tc>
           <w:tcPr>
-            <w:tcW w:type="dxa" w:w="8928"/>
-            <w:tcBorders>
-              <w:top w:val="none"/>
-              <w:left w:val="none"/>
-              <w:bottom w:val="none"/>
-              <w:right w:val="none"/>
-            </w:tcBorders>
+            <w:tcW w:type="dxa" w:w="8352"/>
           </w:tcPr>
           <w:p>
             <w:pPr>
-              <w:spacing w:after="40"/>
+              <w:spacing w:after="20"/>
             </w:pPr>
             <w:r>
               <w:rPr>
                 <w:rFonts w:ascii="Calibri" w:hAnsi="Calibri"/>
                 <w:b/>
-                <w:i w:val="0"/>
-                <w:color w:val="1E40AF"/>
-                <w:sz w:val="40"/>
+                <w:color w:val="0F172A"/>
+                <w:sz w:val="36"/>
               </w:rPr>
               <w:t>ANDRY HUANG</w:t>
-              <w:br/>
             </w:r>
+          </w:p>
+          <w:p>
+            <w:pPr>
+              <w:spacing w:after="60"/>
+            </w:pPr>
             <w:r>
               <w:rPr>
                 <w:rFonts w:ascii="Calibri" w:hAnsi="Calibri"/>
                 <w:b/>
-                <w:i w:val="0"/>
-                <w:color w:val="0F172A"/>
-                <w:sz w:val="22"/>
+                <w:color w:val="1E3A8A"/>
+                <w:sz w:val="19"/>
               </w:rPr>
-              <w:t>Fullstack Developer (.NET | Next.js | Node.js | AI/RAG)</w:t>
-              <w:br/>
+              <w:t>Senior Fullstack &amp; AI Engineer (.NET | Next.js | Node.js | RAG / AI Agents)</w:t>
             </w:r>
+          </w:p>
+          <w:p>
+            <w:pPr>
+              <w:spacing w:after="20"/>
+            </w:pPr>
             <w:r>
               <w:rPr>
                 <w:rFonts w:ascii="Calibri" w:hAnsi="Calibri"/>
-                <w:b w:val="0"/>
-                <w:i w:val="0"/>
                 <w:color w:val="475569"/>
-                <w:sz w:val="18"/>
+                <w:sz w:val="17"/>
               </w:rPr>
-              <w:t>Surabaya, Indonesia  |  +62 813-5729-6386  |  andrych17@gmail.com</w:t>
-              <w:br/>
-              <w:t>LinkedIn: linkedin.com/in/andry-huang-ba410a170  |  Website: https://andryhuang.com</w:t>
+              <w:t xml:space="preserve">Surabaya, Indonesia | +62 813-5729-6386 | </w:t>
             </w:r>
+            <w:hyperlink r:id="rId9" w:history="1">
+              <w:r>
+                <w:rPr>
+                  <w:color w:val="1E3A8A"/>
+                  <w:u w:val="single"/>
+                  <w:sz w:val="17"/>
+                  <w:rFonts w:ascii="Calibri" w:hAnsi="Calibri"/>
+                </w:rPr>
+                <w:t>andrych17@gmail.com</w:t>
+              </w:r>
+            </w:hyperlink>
+          </w:p>
+          <w:p>
+            <w:pPr>
+              <w:spacing w:after="80"/>
+            </w:pPr>
+            <w:r>
+              <w:rPr>
+                <w:rFonts w:ascii="Calibri" w:hAnsi="Calibri"/>
+                <w:color w:val="475569"/>
+                <w:sz w:val="17"/>
+              </w:rPr>
+              <w:t xml:space="preserve">LinkedIn: </w:t>
+            </w:r>
+            <w:hyperlink r:id="rId10" w:history="1">
+              <w:r>
+                <w:rPr>
+                  <w:color w:val="1E3A8A"/>
+                  <w:u w:val="single"/>
+                  <w:sz w:val="17"/>
+                  <w:rFonts w:ascii="Calibri" w:hAnsi="Calibri"/>
+                </w:rPr>
+                <w:t>linkedin.com/in/andry-huang-ba410a170</w:t>
+              </w:r>
+            </w:hyperlink>
+            <w:r>
+              <w:rPr>
+                <w:rFonts w:ascii="Calibri" w:hAnsi="Calibri"/>
+                <w:color w:val="475569"/>
+                <w:sz w:val="17"/>
+              </w:rPr>
+              <w:t xml:space="preserve"> | Website: </w:t>
+            </w:r>
+            <w:hyperlink r:id="rId11" w:history="1">
+              <w:r>
+                <w:rPr>
+                  <w:color w:val="1E3A8A"/>
+                  <w:u w:val="single"/>
+                  <w:sz w:val="17"/>
+                  <w:rFonts w:ascii="Calibri" w:hAnsi="Calibri"/>
+                </w:rPr>
+                <w:t>https://andryhuang.com</w:t>
+              </w:r>
+            </w:hyperlink>
           </w:p>
         </w:tc>
         <w:tc>
           <w:tcPr>
             <w:tcW w:type="dxa" w:w="1872"/>
-            <w:tcBorders>
-              <w:top w:val="none"/>
-              <w:left w:val="none"/>
-              <w:bottom w:val="none"/>
-              <w:right w:val="none"/>
-            </w:tcBorders>
+            <w:vAlign w:val="center"/>
           </w:tcPr>
           <w:p>
             <w:pPr>
-              <w:spacing w:after="0"/>
+              <w:spacing w:after="40"/>
               <w:jc w:val="right"/>
             </w:pPr>
             <w:r>
               <w:drawing>
                 <wp:inline xmlns:a="http://schemas.openxmlformats.org/drawingml/2006/main" xmlns:pic="http://schemas.openxmlformats.org/drawingml/2006/picture">
-                  <wp:extent cx="1051560" cy="1051560"/>
+                  <wp:extent cx="914400" cy="914400"/>
                   <wp:docPr id="1" name="Picture 1"/>
                   <wp:cNvGraphicFramePr>
                     <a:graphicFrameLocks noChangeAspect="1"/>
@@ -91,11 +144,11 @@
                     <a:graphicData uri="http://schemas.openxmlformats.org/drawingml/2006/picture">
                       <pic:pic>
                         <pic:nvPicPr>
-                          <pic:cNvPr id="0" name="processed_photo.png"/>
+                          <pic:cNvPr id="0" name="foto_hd.png"/>
                           <pic:cNvPicPr/>
                         </pic:nvPicPr>
                         <pic:blipFill>
-                          <a:blip r:embed="rId9"/>
+                          <a:blip r:embed="rId12"/>
                           <a:stretch>
                             <a:fillRect/>
                           </a:stretch>
@@ -103,7 +156,7 @@
                         <pic:spPr>
                           <a:xfrm>
                             <a:off x="0" y="0"/>
-                            <a:ext cx="1051560" cy="1051560"/>
+                            <a:ext cx="914400" cy="914400"/>
                           </a:xfrm>
                           <a:prstGeom prst="rect"/>
                         </pic:spPr>
@@ -119,866 +172,702 @@
     </w:tbl>
     <w:p>
       <w:pPr>
-        <w:spacing w:before="140" w:after="50"/>
+        <w:keepNext/>
+        <w:spacing w:before="120" w:after="40"/>
         <w:pBdr>
-          <w:bottom w:val="single" w:sz="6" w:space="1" w:color="1E40AF"/>
+          <w:bottom w:val="single" w:sz="6" w:space="1" w:color="CBD5E1"/>
         </w:pBdr>
       </w:pPr>
       <w:r>
         <w:rPr>
           <w:rFonts w:ascii="Calibri" w:hAnsi="Calibri"/>
           <w:b/>
-          <w:i w:val="0"/>
-          <w:color w:val="1E40AF"/>
-          <w:sz w:val="21"/>
+          <w:color w:val="0F172A"/>
+          <w:sz w:val="19"/>
         </w:rPr>
         <w:t>PROFESSIONAL SUMMARY</w:t>
       </w:r>
     </w:p>
     <w:p>
       <w:pPr>
-        <w:spacing w:after="70" w:line="276" w:lineRule="auto"/>
+        <w:spacing w:after="60"/>
       </w:pPr>
       <w:r>
         <w:rPr>
           <w:rFonts w:ascii="Calibri" w:hAnsi="Calibri"/>
-          <w:b w:val="0"/>
-          <w:i w:val="0"/>
-          <w:color w:val="0F172A"/>
-          <w:sz w:val="19"/>
+          <w:color w:val="1E293B"/>
+          <w:sz w:val="18"/>
         </w:rPr>
-        <w:t>Fullstack &amp; AI Engineer with 6+ years of experience in system design, building, and scaling enterprise SaaS platforms, AI-driven applications, and cloud-integrated solutions. Expert in .NET Core, Next.js, NestJS, React, Node.js, and high-performance SQL optimization. Experienced working in remote international engineering teams (MRI Software - formerly Anacle Systems Ltd, Singapore), enterprise API integrations (DBS Bank, SharePoint), and building RAG &amp; AI Agent workflows with OpenAI &amp; Anthropic Claude APIs.</w:t>
+        <w:t>Senior Fullstack &amp; AI Engineer with 7+ years of experience architecting and building enterprise SaaS platforms, distributed systems, and production AI tools. Core stack: .NET Core, Next.js, Node.js, NestJS, SQL performance tuning, and LLM RAG pipelines. Proven background delivering secure, high-concurrency architectures with international remote engineering teams.</w:t>
       </w:r>
     </w:p>
     <w:p>
       <w:pPr>
-        <w:spacing w:before="140" w:after="50"/>
+        <w:keepNext/>
+        <w:spacing w:before="120" w:after="40"/>
         <w:pBdr>
-          <w:bottom w:val="single" w:sz="6" w:space="1" w:color="1E40AF"/>
+          <w:bottom w:val="single" w:sz="6" w:space="1" w:color="CBD5E1"/>
         </w:pBdr>
       </w:pPr>
       <w:r>
         <w:rPr>
           <w:rFonts w:ascii="Calibri" w:hAnsi="Calibri"/>
           <w:b/>
-          <w:i w:val="0"/>
-          <w:color w:val="1E40AF"/>
-          <w:sz w:val="21"/>
+          <w:color w:val="0F172A"/>
+          <w:sz w:val="19"/>
         </w:rPr>
         <w:t>TECHNICAL SKILLS</w:t>
       </w:r>
     </w:p>
     <w:p>
       <w:pPr>
-        <w:spacing w:after="30"/>
+        <w:spacing w:after="20"/>
       </w:pPr>
       <w:r>
         <w:rPr>
           <w:rFonts w:ascii="Calibri" w:hAnsi="Calibri"/>
           <w:b/>
-          <w:i w:val="0"/>
           <w:color w:val="0F172A"/>
-          <w:sz w:val="19"/>
+          <w:sz w:val="17"/>
         </w:rPr>
-        <w:t xml:space="preserve">•  Frontend &amp; Mobile: </w:t>
+        <w:t xml:space="preserve">•  </w:t>
       </w:r>
       <w:r>
         <w:rPr>
           <w:rFonts w:ascii="Calibri" w:hAnsi="Calibri"/>
-          <w:b w:val="0"/>
-          <w:i w:val="0"/>
+          <w:b/>
           <w:color w:val="0F172A"/>
-          <w:sz w:val="19"/>
+          <w:sz w:val="17"/>
+        </w:rPr>
+        <w:t xml:space="preserve">Backend &amp; Cloud Architecture: </w:t>
+      </w:r>
+      <w:r>
+        <w:rPr>
+          <w:rFonts w:ascii="Calibri" w:hAnsi="Calibri"/>
+          <w:color w:val="1E293B"/>
+          <w:sz w:val="17"/>
+        </w:rPr>
+        <w:t>.NET Core, C#, Node.js, NestJS, Laravel, Java Spring Boot, Python (FastAPI), REST &amp; GraphQL APIs, SaaS Architecture</w:t>
+      </w:r>
+    </w:p>
+    <w:p>
+      <w:pPr>
+        <w:spacing w:after="20"/>
+      </w:pPr>
+      <w:r>
+        <w:rPr>
+          <w:rFonts w:ascii="Calibri" w:hAnsi="Calibri"/>
+          <w:b/>
+          <w:color w:val="0F172A"/>
+          <w:sz w:val="17"/>
+        </w:rPr>
+        <w:t xml:space="preserve">•  </w:t>
+      </w:r>
+      <w:r>
+        <w:rPr>
+          <w:rFonts w:ascii="Calibri" w:hAnsi="Calibri"/>
+          <w:b/>
+          <w:color w:val="0F172A"/>
+          <w:sz w:val="17"/>
+        </w:rPr>
+        <w:t xml:space="preserve">AI Engineering &amp; Automation: </w:t>
+      </w:r>
+      <w:r>
+        <w:rPr>
+          <w:rFonts w:ascii="Calibri" w:hAnsi="Calibri"/>
+          <w:color w:val="1E293B"/>
+          <w:sz w:val="17"/>
+        </w:rPr>
+        <w:t>RAG Architecture, OpenAI GPT-4o, Anthropic Claude API, Model Context Protocol (MCP), Autonomous AI Agents, pgvector, BullMQ, Prompt Engineering</w:t>
+      </w:r>
+    </w:p>
+    <w:p>
+      <w:pPr>
+        <w:spacing w:after="20"/>
+      </w:pPr>
+      <w:r>
+        <w:rPr>
+          <w:rFonts w:ascii="Calibri" w:hAnsi="Calibri"/>
+          <w:b/>
+          <w:color w:val="0F172A"/>
+          <w:sz w:val="17"/>
+        </w:rPr>
+        <w:t xml:space="preserve">•  </w:t>
+      </w:r>
+      <w:r>
+        <w:rPr>
+          <w:rFonts w:ascii="Calibri" w:hAnsi="Calibri"/>
+          <w:b/>
+          <w:color w:val="0F172A"/>
+          <w:sz w:val="17"/>
+        </w:rPr>
+        <w:t xml:space="preserve">Frontend &amp; Mobile: </w:t>
+      </w:r>
+      <w:r>
+        <w:rPr>
+          <w:rFonts w:ascii="Calibri" w:hAnsi="Calibri"/>
+          <w:color w:val="1E293B"/>
+          <w:sz w:val="17"/>
         </w:rPr>
         <w:t>Next.js, React, TypeScript, JavaScript, Tailwind CSS, Flutter, Android Native, Livewire, Alpine.js</w:t>
       </w:r>
     </w:p>
     <w:p>
       <w:pPr>
-        <w:spacing w:after="30"/>
+        <w:spacing w:after="20"/>
       </w:pPr>
       <w:r>
         <w:rPr>
           <w:rFonts w:ascii="Calibri" w:hAnsi="Calibri"/>
           <w:b/>
-          <w:i w:val="0"/>
           <w:color w:val="0F172A"/>
-          <w:sz w:val="19"/>
+          <w:sz w:val="17"/>
         </w:rPr>
-        <w:t xml:space="preserve">•  Backend &amp; APIs: </w:t>
+        <w:t xml:space="preserve">•  </w:t>
       </w:r>
       <w:r>
         <w:rPr>
           <w:rFonts w:ascii="Calibri" w:hAnsi="Calibri"/>
-          <w:b w:val="0"/>
-          <w:i w:val="0"/>
+          <w:b/>
           <w:color w:val="0F172A"/>
-          <w:sz w:val="19"/>
+          <w:sz w:val="17"/>
         </w:rPr>
-        <w:t>.NET Core / .NET Framework, C#, Node.js, NestJS, System Design &amp; SaaS Architecture, Laravel (Livewire), Java Spring Boot, Python (FastAPI), REST &amp; GraphQL APIs</w:t>
+        <w:t xml:space="preserve">Databases &amp; Storage: </w:t>
+      </w:r>
+      <w:r>
+        <w:rPr>
+          <w:rFonts w:ascii="Calibri" w:hAnsi="Calibri"/>
+          <w:color w:val="1E293B"/>
+          <w:sz w:val="17"/>
+        </w:rPr>
+        <w:t>PostgreSQL, SQL Server, MySQL, Oracle DB, Redis, Elasticsearch, AWS S3, Azure Blob, Cloudflare R2</w:t>
       </w:r>
     </w:p>
     <w:p>
       <w:pPr>
-        <w:spacing w:after="30"/>
+        <w:spacing w:after="20"/>
       </w:pPr>
       <w:r>
         <w:rPr>
           <w:rFonts w:ascii="Calibri" w:hAnsi="Calibri"/>
           <w:b/>
-          <w:i w:val="0"/>
           <w:color w:val="0F172A"/>
-          <w:sz w:val="19"/>
+          <w:sz w:val="17"/>
         </w:rPr>
-        <w:t xml:space="preserve">•  AI &amp; Automation: </w:t>
+        <w:t xml:space="preserve">•  </w:t>
       </w:r>
       <w:r>
         <w:rPr>
           <w:rFonts w:ascii="Calibri" w:hAnsi="Calibri"/>
-          <w:b w:val="0"/>
-          <w:i w:val="0"/>
+          <w:b/>
           <w:color w:val="0F172A"/>
-          <w:sz w:val="19"/>
+          <w:sz w:val="17"/>
         </w:rPr>
-        <w:t>RAG Architecture, OpenAI GPT-4o &amp; Anthropic Claude APIs, Model Context Protocol (MCP), Autonomous AI Coding Agents, Vector DBs (pgvector), BullMQ, Prompt Engineering</w:t>
+        <w:t xml:space="preserve">DevOps, CI/CD &amp; Security: </w:t>
+      </w:r>
+      <w:r>
+        <w:rPr>
+          <w:rFonts w:ascii="Calibri" w:hAnsi="Calibri"/>
+          <w:color w:val="1E293B"/>
+          <w:sz w:val="17"/>
+        </w:rPr>
+        <w:t>Docker, GitHub Actions, Azure DevOps, GitLab CI, Linux Administration, Nginx, Fail2ban, SonarQube, SSH Security</w:t>
       </w:r>
     </w:p>
     <w:p>
       <w:pPr>
-        <w:spacing w:after="30"/>
+        <w:spacing w:after="20"/>
       </w:pPr>
       <w:r>
         <w:rPr>
           <w:rFonts w:ascii="Calibri" w:hAnsi="Calibri"/>
           <w:b/>
-          <w:i w:val="0"/>
           <w:color w:val="0F172A"/>
-          <w:sz w:val="19"/>
+          <w:sz w:val="17"/>
         </w:rPr>
-        <w:t xml:space="preserve">•  Databases &amp; Cloud: </w:t>
+        <w:t xml:space="preserve">•  </w:t>
       </w:r>
       <w:r>
         <w:rPr>
           <w:rFonts w:ascii="Calibri" w:hAnsi="Calibri"/>
-          <w:b w:val="0"/>
-          <w:i w:val="0"/>
+          <w:b/>
           <w:color w:val="0F172A"/>
-          <w:sz w:val="19"/>
+          <w:sz w:val="17"/>
         </w:rPr>
-        <w:t>AWS (S3, EC2), Azure (Blob Storage, DevOps), PostgreSQL, MySQL, SQL Server, Oracle DB, Redis, Elasticsearch, Cloudflare R2</w:t>
+        <w:t xml:space="preserve">Testing &amp; Integrations: </w:t>
+      </w:r>
+      <w:r>
+        <w:rPr>
+          <w:rFonts w:ascii="Calibri" w:hAnsi="Calibri"/>
+          <w:color w:val="1E293B"/>
+          <w:sz w:val="17"/>
+        </w:rPr>
+        <w:t>Playwright, Selenium, Midtrans Payment Gateway, RajaOngkir, RFID Hardware, Leaflet GIS</w:t>
       </w:r>
     </w:p>
     <w:p>
       <w:pPr>
-        <w:spacing w:after="30"/>
-      </w:pPr>
-      <w:r>
-        <w:rPr>
-          <w:rFonts w:ascii="Calibri" w:hAnsi="Calibri"/>
-          <w:b/>
-          <w:i w:val="0"/>
-          <w:color w:val="0F172A"/>
-          <w:sz w:val="19"/>
-        </w:rPr>
-        <w:t xml:space="preserve">•  DevOps &amp; Security: </w:t>
-      </w:r>
-      <w:r>
-        <w:rPr>
-          <w:rFonts w:ascii="Calibri" w:hAnsi="Calibri"/>
-          <w:b w:val="0"/>
-          <w:i w:val="0"/>
-          <w:color w:val="0F172A"/>
-          <w:sz w:val="19"/>
-        </w:rPr>
-        <w:t>GitHub Actions, Docker &amp; Docker Compose, CI/CD Pipelines (Azure DevOps, GitLab CI, Jenkins), Linux Administration, Nginx, Fail2ban, SonarQube, SSH Security</w:t>
-      </w:r>
-    </w:p>
-    <w:p>
-      <w:pPr>
-        <w:spacing w:after="30"/>
-      </w:pPr>
-      <w:r>
-        <w:rPr>
-          <w:rFonts w:ascii="Calibri" w:hAnsi="Calibri"/>
-          <w:b/>
-          <w:i w:val="0"/>
-          <w:color w:val="0F172A"/>
-          <w:sz w:val="19"/>
-        </w:rPr>
-        <w:t xml:space="preserve">•  Tools &amp; Testing: </w:t>
-      </w:r>
-      <w:r>
-        <w:rPr>
-          <w:rFonts w:ascii="Calibri" w:hAnsi="Calibri"/>
-          <w:b w:val="0"/>
-          <w:i w:val="0"/>
-          <w:color w:val="0F172A"/>
-          <w:sz w:val="19"/>
-        </w:rPr>
-        <w:t>Playwright, Selenium, Git, Midtrans Payment Gateway, RajaOngkir, RFID Hardware Integration, Leaflet GIS Maps</w:t>
-      </w:r>
-    </w:p>
-    <w:p>
-      <w:pPr>
-        <w:spacing w:before="140" w:after="50"/>
+        <w:keepNext/>
+        <w:spacing w:before="120" w:after="40"/>
         <w:pBdr>
-          <w:bottom w:val="single" w:sz="6" w:space="1" w:color="1E40AF"/>
+          <w:bottom w:val="single" w:sz="6" w:space="1" w:color="CBD5E1"/>
         </w:pBdr>
       </w:pPr>
       <w:r>
         <w:rPr>
           <w:rFonts w:ascii="Calibri" w:hAnsi="Calibri"/>
           <w:b/>
-          <w:i w:val="0"/>
-          <w:color w:val="1E40AF"/>
-          <w:sz w:val="21"/>
+          <w:color w:val="0F172A"/>
+          <w:sz w:val="19"/>
         </w:rPr>
         <w:t>WORK EXPERIENCE</w:t>
       </w:r>
     </w:p>
     <w:p>
       <w:pPr>
-        <w:spacing w:before="60" w:after="30"/>
+        <w:keepNext/>
+        <w:spacing w:before="60" w:after="20"/>
       </w:pPr>
       <w:r>
         <w:rPr>
           <w:rFonts w:ascii="Calibri" w:hAnsi="Calibri"/>
           <w:b/>
-          <w:i w:val="0"/>
           <w:color w:val="0F172A"/>
-          <w:sz w:val="20"/>
+          <w:sz w:val="18"/>
         </w:rPr>
-        <w:t>Fullstack Developer</w:t>
+        <w:t xml:space="preserve">Fullstack Developer | </w:t>
+      </w:r>
+      <w:hyperlink r:id="rId13" w:history="1">
+        <w:r>
+          <w:rPr>
+            <w:color w:val="0F172A"/>
+            <w:u w:val="single"/>
+            <w:b/>
+            <w:sz w:val="18"/>
+            <w:rFonts w:ascii="Calibri" w:hAnsi="Calibri"/>
+          </w:rPr>
+          <w:t>MRI Software</w:t>
+        </w:r>
+      </w:hyperlink>
+      <w:r>
+        <w:rPr>
+          <w:rFonts w:ascii="Calibri" w:hAnsi="Calibri"/>
+          <w:b/>
+          <w:color w:val="0F172A"/>
+          <w:sz w:val="18"/>
+        </w:rPr>
+        <w:t xml:space="preserve"> (formerly </w:t>
+      </w:r>
+      <w:hyperlink r:id="rId14" w:history="1">
+        <w:r>
+          <w:rPr>
+            <w:color w:val="0F172A"/>
+            <w:u w:val="single"/>
+            <w:b/>
+            <w:sz w:val="18"/>
+            <w:rFonts w:ascii="Calibri" w:hAnsi="Calibri"/>
+          </w:rPr>
+          <w:t>Anacle Systems Ltd</w:t>
+        </w:r>
+      </w:hyperlink>
+      <w:r>
+        <w:rPr>
+          <w:rFonts w:ascii="Calibri" w:hAnsi="Calibri"/>
+          <w:b/>
+          <w:color w:val="0F172A"/>
+          <w:sz w:val="18"/>
+        </w:rPr>
+        <w:t>)</w:t>
       </w:r>
       <w:r>
         <w:rPr>
           <w:rFonts w:ascii="Calibri" w:hAnsi="Calibri"/>
-          <w:b w:val="0"/>
-          <w:i/>
           <w:color w:val="475569"/>
-          <w:sz w:val="20"/>
+          <w:sz w:val="17"/>
         </w:rPr>
-        <w:t xml:space="preserve"> | MRI Software (formerly Anacle Systems Ltd) (Singapore (Remote))</w:t>
-      </w:r>
-      <w:r>
-        <w:rPr>
-          <w:rFonts w:ascii="Calibri" w:hAnsi="Calibri"/>
-          <w:b/>
-          <w:i w:val="0"/>
-          <w:color w:val="1E40AF"/>
-          <w:sz w:val="19"/>
-        </w:rPr>
-        <w:t xml:space="preserve"> | Nov 2022 - Mar 2026</w:t>
+        <w:t xml:space="preserve"> (Singapore (Remote)) | Nov 2022 - Mar 2026</w:t>
       </w:r>
     </w:p>
     <w:p>
       <w:pPr>
-        <w:spacing w:after="30"/>
-        <w:ind w:left="259"/>
-      </w:pPr>
-      <w:r>
-        <w:rPr>
-          <w:rFonts w:ascii="Calibri" w:hAnsi="Calibri"/>
-          <w:b w:val="0"/>
-          <w:i w:val="0"/>
-          <w:color w:val="1E40AF"/>
-          <w:sz w:val="18"/>
-        </w:rPr>
-        <w:t xml:space="preserve">• </w:t>
-      </w:r>
-      <w:r>
-        <w:rPr>
-          <w:rFonts w:ascii="Calibri" w:hAnsi="Calibri"/>
-          <w:b w:val="0"/>
-          <w:i w:val="0"/>
-          <w:color w:val="0F172A"/>
-          <w:sz w:val="19"/>
-        </w:rPr>
-        <w:t>Engineered and maintained enterprise SaaS platforms (Anacle Simplicity &amp; SMRT Tenant Management System), developing mall tender submission, tenant application processing, space leasing, and tenant operations using .NET Core, .NET Framework 4.8, Next.js, and NestJS.</w:t>
-      </w:r>
-    </w:p>
-    <w:p>
-      <w:pPr>
-        <w:spacing w:after="30"/>
-        <w:ind w:left="259"/>
-      </w:pPr>
-      <w:r>
-        <w:rPr>
-          <w:rFonts w:ascii="Calibri" w:hAnsi="Calibri"/>
-          <w:b w:val="0"/>
-          <w:i w:val="0"/>
-          <w:color w:val="1E40AF"/>
-          <w:sz w:val="18"/>
-        </w:rPr>
-        <w:t xml:space="preserve">• </w:t>
-      </w:r>
-      <w:r>
-        <w:rPr>
-          <w:rFonts w:ascii="Calibri" w:hAnsi="Calibri"/>
-          <w:b w:val="0"/>
-          <w:i w:val="0"/>
-          <w:color w:val="0F172A"/>
-          <w:sz w:val="19"/>
-        </w:rPr>
-        <w:t>Built and deployed RAG architecture with OpenAI API and vector databases (pgvector) for automated report generation and semantic search.</w:t>
-      </w:r>
-    </w:p>
-    <w:p>
-      <w:pPr>
-        <w:spacing w:after="30"/>
-        <w:ind w:left="259"/>
-      </w:pPr>
-      <w:r>
-        <w:rPr>
-          <w:rFonts w:ascii="Calibri" w:hAnsi="Calibri"/>
-          <w:b w:val="0"/>
-          <w:i w:val="0"/>
-          <w:color w:val="1E40AF"/>
-          <w:sz w:val="18"/>
-        </w:rPr>
-        <w:t xml:space="preserve">• </w:t>
-      </w:r>
-      <w:r>
-        <w:rPr>
-          <w:rFonts w:ascii="Calibri" w:hAnsi="Calibri"/>
-          <w:b w:val="0"/>
-          <w:i w:val="0"/>
-          <w:color w:val="0F172A"/>
-          <w:sz w:val="19"/>
-        </w:rPr>
-        <w:t>Refactored legacy .NET Framework 4.8 / SQL Server procedures and conducted Selenium automated UI testing across SaaS modules.</w:t>
-      </w:r>
-    </w:p>
-    <w:p>
-      <w:pPr>
-        <w:spacing w:before="40" w:after="20"/>
+        <w:spacing w:after="20"/>
         <w:ind w:left="259"/>
       </w:pPr>
       <w:r>
         <w:rPr>
           <w:rFonts w:ascii="Calibri" w:hAnsi="Calibri"/>
           <w:b/>
-          <w:i w:val="0"/>
-          <w:color w:val="1E40AF"/>
-          <w:sz w:val="19"/>
+          <w:color w:val="0F172A"/>
+          <w:sz w:val="17"/>
         </w:rPr>
-        <w:t>Key Achievements:</w:t>
+        <w:t xml:space="preserve">•  </w:t>
+      </w:r>
+      <w:r>
+        <w:rPr>
+          <w:rFonts w:ascii="Calibri" w:hAnsi="Calibri"/>
+          <w:color w:val="1E293B"/>
+          <w:sz w:val="17"/>
+        </w:rPr>
+        <w:t>Scaled enterprise SaaS platforms (Anacle Simplicity &amp; SMRT Tenant Management System), supporting mall tender submissions, space leasing, tenant applications, and day-to-day operations using .NET Core, .NET Framework 4.8, Next.js, and NestJS.</w:t>
       </w:r>
     </w:p>
     <w:p>
       <w:pPr>
-        <w:spacing w:after="30"/>
-        <w:ind w:left="504"/>
-      </w:pPr>
-      <w:r>
-        <w:rPr>
-          <w:rFonts w:ascii="Calibri" w:hAnsi="Calibri"/>
-          <w:b/>
-          <w:i w:val="0"/>
-          <w:color w:val="1E40AF"/>
-          <w:sz w:val="18"/>
-        </w:rPr>
-        <w:t xml:space="preserve">✓  </w:t>
-      </w:r>
-      <w:r>
-        <w:rPr>
-          <w:rFonts w:ascii="Calibri" w:hAnsi="Calibri"/>
-          <w:b/>
-          <w:i w:val="0"/>
-          <w:color w:val="0F172A"/>
-          <w:sz w:val="19"/>
-        </w:rPr>
-        <w:t xml:space="preserve">Go-Live SMRT Tenant Management: </w:t>
-      </w:r>
-      <w:r>
-        <w:rPr>
-          <w:rFonts w:ascii="Calibri" w:hAnsi="Calibri"/>
-          <w:b w:val="0"/>
-          <w:i w:val="0"/>
-          <w:color w:val="0F172A"/>
-          <w:sz w:val="19"/>
-        </w:rPr>
-        <w:t xml:space="preserve"> Successfully delivered and launched the enterprise tenant management platform for SMRT Singapore, digitizing mall tender submissions, tenant applications, space leasing, and tenant operations.</w:t>
-      </w:r>
-    </w:p>
-    <w:p>
-      <w:pPr>
-        <w:spacing w:after="30"/>
-        <w:ind w:left="504"/>
-      </w:pPr>
-      <w:r>
-        <w:rPr>
-          <w:rFonts w:ascii="Calibri" w:hAnsi="Calibri"/>
-          <w:b/>
-          <w:i w:val="0"/>
-          <w:color w:val="1E40AF"/>
-          <w:sz w:val="18"/>
-        </w:rPr>
-        <w:t xml:space="preserve">✓  </w:t>
-      </w:r>
-      <w:r>
-        <w:rPr>
-          <w:rFonts w:ascii="Calibri" w:hAnsi="Calibri"/>
-          <w:b/>
-          <w:i w:val="0"/>
-          <w:color w:val="0F172A"/>
-          <w:sz w:val="19"/>
-        </w:rPr>
-        <w:t xml:space="preserve">Go-Live SharePoint Document Migration: </w:t>
-      </w:r>
-      <w:r>
-        <w:rPr>
-          <w:rFonts w:ascii="Calibri" w:hAnsi="Calibri"/>
-          <w:b w:val="0"/>
-          <w:i w:val="0"/>
-          <w:color w:val="0F172A"/>
-          <w:sz w:val="19"/>
-        </w:rPr>
-        <w:t xml:space="preserve"> Engineered document migration service syncing 100,000+ enterprise files to SharePoint Graph API, AWS S3, and Azure Blob with RBAC &amp; audit logging.</w:t>
-      </w:r>
-    </w:p>
-    <w:p>
-      <w:pPr>
-        <w:spacing w:after="30"/>
-        <w:ind w:left="504"/>
-      </w:pPr>
-      <w:r>
-        <w:rPr>
-          <w:rFonts w:ascii="Calibri" w:hAnsi="Calibri"/>
-          <w:b/>
-          <w:i w:val="0"/>
-          <w:color w:val="1E40AF"/>
-          <w:sz w:val="18"/>
-        </w:rPr>
-        <w:t xml:space="preserve">✓  </w:t>
-      </w:r>
-      <w:r>
-        <w:rPr>
-          <w:rFonts w:ascii="Calibri" w:hAnsi="Calibri"/>
-          <w:b/>
-          <w:i w:val="0"/>
-          <w:color w:val="0F172A"/>
-          <w:sz w:val="19"/>
-        </w:rPr>
-        <w:t xml:space="preserve">SonarQube Security &amp; Quality Pipeline: </w:t>
-      </w:r>
-      <w:r>
-        <w:rPr>
-          <w:rFonts w:ascii="Calibri" w:hAnsi="Calibri"/>
-          <w:b w:val="0"/>
-          <w:i w:val="0"/>
-          <w:color w:val="0F172A"/>
-          <w:sz w:val="19"/>
-        </w:rPr>
-        <w:t xml:space="preserve"> Spearheaded static code analysis across multiple internal enterprise projects, identifying and fixing security vulnerabilities, establishing automated CI/CD quality gates, and enforcing zero-vulnerability deployment standards.</w:t>
-      </w:r>
-    </w:p>
-    <w:p>
-      <w:pPr>
-        <w:spacing w:before="60" w:after="30"/>
-      </w:pPr>
-      <w:r>
-        <w:rPr>
-          <w:rFonts w:ascii="Calibri" w:hAnsi="Calibri"/>
-          <w:b/>
-          <w:i w:val="0"/>
-          <w:color w:val="0F172A"/>
-          <w:sz w:val="20"/>
-        </w:rPr>
-        <w:t>Fullstack Developer</w:t>
-      </w:r>
-      <w:r>
-        <w:rPr>
-          <w:rFonts w:ascii="Calibri" w:hAnsi="Calibri"/>
-          <w:b w:val="0"/>
-          <w:i/>
-          <w:color w:val="475569"/>
-          <w:sz w:val="20"/>
-        </w:rPr>
-        <w:t xml:space="preserve"> | Software House (Surabaya, Indonesia)</w:t>
-      </w:r>
-      <w:r>
-        <w:rPr>
-          <w:rFonts w:ascii="Calibri" w:hAnsi="Calibri"/>
-          <w:b/>
-          <w:i w:val="0"/>
-          <w:color w:val="1E40AF"/>
-          <w:sz w:val="19"/>
-        </w:rPr>
-        <w:t xml:space="preserve"> | Mar 2022 - Nov 2022</w:t>
-      </w:r>
-    </w:p>
-    <w:p>
-      <w:pPr>
-        <w:spacing w:after="30"/>
-        <w:ind w:left="259"/>
-      </w:pPr>
-      <w:r>
-        <w:rPr>
-          <w:rFonts w:ascii="Calibri" w:hAnsi="Calibri"/>
-          <w:b w:val="0"/>
-          <w:i w:val="0"/>
-          <w:color w:val="1E40AF"/>
-          <w:sz w:val="18"/>
-        </w:rPr>
-        <w:t xml:space="preserve">• </w:t>
-      </w:r>
-      <w:r>
-        <w:rPr>
-          <w:rFonts w:ascii="Calibri" w:hAnsi="Calibri"/>
-          <w:b w:val="0"/>
-          <w:i w:val="0"/>
-          <w:color w:val="0F172A"/>
-          <w:sz w:val="19"/>
-        </w:rPr>
-        <w:t>Developed scalable web applications using Node.js and Next.js, optimizing high-concurrency SQL queries and backend services.</w:t>
-      </w:r>
-    </w:p>
-    <w:p>
-      <w:pPr>
-        <w:spacing w:after="30"/>
-        <w:ind w:left="259"/>
-      </w:pPr>
-      <w:r>
-        <w:rPr>
-          <w:rFonts w:ascii="Calibri" w:hAnsi="Calibri"/>
-          <w:b w:val="0"/>
-          <w:i w:val="0"/>
-          <w:color w:val="1E40AF"/>
-          <w:sz w:val="18"/>
-        </w:rPr>
-        <w:t xml:space="preserve">• </w:t>
-      </w:r>
-      <w:r>
-        <w:rPr>
-          <w:rFonts w:ascii="Calibri" w:hAnsi="Calibri"/>
-          <w:b w:val="0"/>
-          <w:i w:val="0"/>
-          <w:color w:val="0F172A"/>
-          <w:sz w:val="19"/>
-        </w:rPr>
-        <w:t>Managed self-hosted Git servers, configured Elasticsearch infrastructure for log indexing, and upgraded enterprise Java runtime versions.</w:t>
-      </w:r>
-    </w:p>
-    <w:p>
-      <w:pPr>
-        <w:spacing w:before="40" w:after="20"/>
+        <w:spacing w:after="20"/>
         <w:ind w:left="259"/>
       </w:pPr>
       <w:r>
         <w:rPr>
           <w:rFonts w:ascii="Calibri" w:hAnsi="Calibri"/>
           <w:b/>
-          <w:i w:val="0"/>
-          <w:color w:val="1E40AF"/>
-          <w:sz w:val="19"/>
+          <w:color w:val="0F172A"/>
+          <w:sz w:val="17"/>
         </w:rPr>
-        <w:t>Key Achievements:</w:t>
+        <w:t xml:space="preserve">•  </w:t>
+      </w:r>
+      <w:r>
+        <w:rPr>
+          <w:rFonts w:ascii="Calibri" w:hAnsi="Calibri"/>
+          <w:color w:val="1E293B"/>
+          <w:sz w:val="17"/>
+        </w:rPr>
+        <w:t>Deployed production RAG pipelines using OpenAI API and PostgreSQL (pgvector) for semantic document retrieval, search, and automated executive reporting.</w:t>
       </w:r>
     </w:p>
     <w:p>
       <w:pPr>
-        <w:spacing w:after="30"/>
-        <w:ind w:left="504"/>
-      </w:pPr>
-      <w:r>
-        <w:rPr>
-          <w:rFonts w:ascii="Calibri" w:hAnsi="Calibri"/>
-          <w:b/>
-          <w:i w:val="0"/>
-          <w:color w:val="1E40AF"/>
-          <w:sz w:val="18"/>
-        </w:rPr>
-        <w:t xml:space="preserve">✓  </w:t>
-      </w:r>
-      <w:r>
-        <w:rPr>
-          <w:rFonts w:ascii="Calibri" w:hAnsi="Calibri"/>
-          <w:b/>
-          <w:i w:val="0"/>
-          <w:color w:val="0F172A"/>
-          <w:sz w:val="19"/>
-        </w:rPr>
-        <w:t xml:space="preserve">Database Cleanup &amp; Data Recovery: </w:t>
-      </w:r>
-      <w:r>
-        <w:rPr>
-          <w:rFonts w:ascii="Calibri" w:hAnsi="Calibri"/>
-          <w:b w:val="0"/>
-          <w:i w:val="0"/>
-          <w:color w:val="0F172A"/>
-          <w:sz w:val="19"/>
-        </w:rPr>
-        <w:t xml:space="preserve"> Successfully repaired and cleaned 10,000+ corrupted database records caused by legacy code logic bugs.</w:t>
-      </w:r>
-    </w:p>
-    <w:p>
-      <w:pPr>
-        <w:spacing w:after="30"/>
-        <w:ind w:left="504"/>
-      </w:pPr>
-      <w:r>
-        <w:rPr>
-          <w:rFonts w:ascii="Calibri" w:hAnsi="Calibri"/>
-          <w:b/>
-          <w:i w:val="0"/>
-          <w:color w:val="1E40AF"/>
-          <w:sz w:val="18"/>
-        </w:rPr>
-        <w:t xml:space="preserve">✓  </w:t>
-      </w:r>
-      <w:r>
-        <w:rPr>
-          <w:rFonts w:ascii="Calibri" w:hAnsi="Calibri"/>
-          <w:b/>
-          <w:i w:val="0"/>
-          <w:color w:val="0F172A"/>
-          <w:sz w:val="19"/>
-        </w:rPr>
-        <w:t xml:space="preserve">Incident &amp; Ticket Reduction: </w:t>
-      </w:r>
-      <w:r>
-        <w:rPr>
-          <w:rFonts w:ascii="Calibri" w:hAnsi="Calibri"/>
-          <w:b w:val="0"/>
-          <w:i w:val="0"/>
-          <w:color w:val="0F172A"/>
-          <w:sz w:val="19"/>
-        </w:rPr>
-        <w:t xml:space="preserve"> Resolved core architectural bottlenecks, eliminating recurring high-priority incident tickets.</w:t>
-      </w:r>
-    </w:p>
-    <w:p>
-      <w:pPr>
-        <w:spacing w:before="60" w:after="30"/>
-      </w:pPr>
-      <w:r>
-        <w:rPr>
-          <w:rFonts w:ascii="Calibri" w:hAnsi="Calibri"/>
-          <w:b/>
-          <w:i w:val="0"/>
-          <w:color w:val="0F172A"/>
-          <w:sz w:val="20"/>
-        </w:rPr>
-        <w:t>Full-Stack Developer</w:t>
-      </w:r>
-      <w:r>
-        <w:rPr>
-          <w:rFonts w:ascii="Calibri" w:hAnsi="Calibri"/>
-          <w:b w:val="0"/>
-          <w:i/>
-          <w:color w:val="475569"/>
-          <w:sz w:val="20"/>
-        </w:rPr>
-        <w:t xml:space="preserve"> | PT Tjiwi Kimia (Indonesia)</w:t>
-      </w:r>
-      <w:r>
-        <w:rPr>
-          <w:rFonts w:ascii="Calibri" w:hAnsi="Calibri"/>
-          <w:b/>
-          <w:i w:val="0"/>
-          <w:color w:val="1E40AF"/>
-          <w:sz w:val="19"/>
-        </w:rPr>
-        <w:t xml:space="preserve"> | Sep 2019 - Feb 2022</w:t>
-      </w:r>
-    </w:p>
-    <w:p>
-      <w:pPr>
-        <w:spacing w:after="30"/>
-        <w:ind w:left="259"/>
-      </w:pPr>
-      <w:r>
-        <w:rPr>
-          <w:rFonts w:ascii="Calibri" w:hAnsi="Calibri"/>
-          <w:b w:val="0"/>
-          <w:i w:val="0"/>
-          <w:color w:val="1E40AF"/>
-          <w:sz w:val="18"/>
-        </w:rPr>
-        <w:t xml:space="preserve">• </w:t>
-      </w:r>
-      <w:r>
-        <w:rPr>
-          <w:rFonts w:ascii="Calibri" w:hAnsi="Calibri"/>
-          <w:b w:val="0"/>
-          <w:i w:val="0"/>
-          <w:color w:val="0F172A"/>
-          <w:sz w:val="19"/>
-        </w:rPr>
-        <w:t>Developed enterprise web solutions and internal reporting modules for pulp &amp; paper manufacturing using .NET Core, C#, ASP Classic, and SQL Server.</w:t>
-      </w:r>
-    </w:p>
-    <w:p>
-      <w:pPr>
-        <w:spacing w:after="30"/>
-        <w:ind w:left="259"/>
-      </w:pPr>
-      <w:r>
-        <w:rPr>
-          <w:rFonts w:ascii="Calibri" w:hAnsi="Calibri"/>
-          <w:b w:val="0"/>
-          <w:i w:val="0"/>
-          <w:color w:val="1E40AF"/>
-          <w:sz w:val="18"/>
-        </w:rPr>
-        <w:t xml:space="preserve">• </w:t>
-      </w:r>
-      <w:r>
-        <w:rPr>
-          <w:rFonts w:ascii="Calibri" w:hAnsi="Calibri"/>
-          <w:b w:val="0"/>
-          <w:i w:val="0"/>
-          <w:color w:val="0F172A"/>
-          <w:sz w:val="19"/>
-        </w:rPr>
-        <w:t>Built an automated WhatsApp Scheduler Bot using Python, Java, &amp; Selenium for real-time production reporting and alert dispatches.</w:t>
-      </w:r>
-    </w:p>
-    <w:p>
-      <w:pPr>
-        <w:spacing w:after="30"/>
-        <w:ind w:left="259"/>
-      </w:pPr>
-      <w:r>
-        <w:rPr>
-          <w:rFonts w:ascii="Calibri" w:hAnsi="Calibri"/>
-          <w:b w:val="0"/>
-          <w:i w:val="0"/>
-          <w:color w:val="1E40AF"/>
-          <w:sz w:val="18"/>
-        </w:rPr>
-        <w:t xml:space="preserve">• </w:t>
-      </w:r>
-      <w:r>
-        <w:rPr>
-          <w:rFonts w:ascii="Calibri" w:hAnsi="Calibri"/>
-          <w:b w:val="0"/>
-          <w:i w:val="0"/>
-          <w:color w:val="0F172A"/>
-          <w:sz w:val="19"/>
-        </w:rPr>
-        <w:t>Designed and deployed a native Android Barcode Scanner Mobile Application for real-time warehouse inventory stock-in / stock-out tracking.</w:t>
-      </w:r>
-    </w:p>
-    <w:p>
-      <w:pPr>
-        <w:spacing w:after="30"/>
-        <w:ind w:left="259"/>
-      </w:pPr>
-      <w:r>
-        <w:rPr>
-          <w:rFonts w:ascii="Calibri" w:hAnsi="Calibri"/>
-          <w:b w:val="0"/>
-          <w:i w:val="0"/>
-          <w:color w:val="1E40AF"/>
-          <w:sz w:val="18"/>
-        </w:rPr>
-        <w:t xml:space="preserve">• </w:t>
-      </w:r>
-      <w:r>
-        <w:rPr>
-          <w:rFonts w:ascii="Calibri" w:hAnsi="Calibri"/>
-          <w:b w:val="0"/>
-          <w:i w:val="0"/>
-          <w:color w:val="0F172A"/>
-          <w:sz w:val="19"/>
-        </w:rPr>
-        <w:t>Developed an automated COVID-19 Employee Health Survey &amp; Questionnaire web application for company-wide pandemic check-ins and contact tracing.</w:t>
-      </w:r>
-    </w:p>
-    <w:p>
-      <w:pPr>
-        <w:spacing w:after="30"/>
-        <w:ind w:left="259"/>
-      </w:pPr>
-      <w:r>
-        <w:rPr>
-          <w:rFonts w:ascii="Calibri" w:hAnsi="Calibri"/>
-          <w:b w:val="0"/>
-          <w:i w:val="0"/>
-          <w:color w:val="1E40AF"/>
-          <w:sz w:val="18"/>
-        </w:rPr>
-        <w:t xml:space="preserve">• </w:t>
-      </w:r>
-      <w:r>
-        <w:rPr>
-          <w:rFonts w:ascii="Calibri" w:hAnsi="Calibri"/>
-          <w:b w:val="0"/>
-          <w:i w:val="0"/>
-          <w:color w:val="0F172A"/>
-          <w:sz w:val="19"/>
-        </w:rPr>
-        <w:t>Developed an automated lottery &amp; raffle draw web application for Tjiwi Kimia's company anniversary celebration events.</w:t>
-      </w:r>
-    </w:p>
-    <w:p>
-      <w:pPr>
-        <w:spacing w:before="40" w:after="20"/>
+        <w:spacing w:after="20"/>
         <w:ind w:left="259"/>
       </w:pPr>
       <w:r>
         <w:rPr>
           <w:rFonts w:ascii="Calibri" w:hAnsi="Calibri"/>
           <w:b/>
-          <w:i w:val="0"/>
-          <w:color w:val="1E40AF"/>
-          <w:sz w:val="19"/>
+          <w:color w:val="0F172A"/>
+          <w:sz w:val="17"/>
         </w:rPr>
-        <w:t>Key Achievements:</w:t>
+        <w:t xml:space="preserve">•  </w:t>
+      </w:r>
+      <w:r>
+        <w:rPr>
+          <w:rFonts w:ascii="Calibri" w:hAnsi="Calibri"/>
+          <w:color w:val="1E293B"/>
+          <w:sz w:val="17"/>
+        </w:rPr>
+        <w:t>Built a document migration microservice syncing 100,000+ enterprise files to SharePoint Graph API, AWS S3, and Azure Blob Storage with RBAC security and audit logging.</w:t>
       </w:r>
     </w:p>
     <w:p>
       <w:pPr>
-        <w:spacing w:after="30"/>
-        <w:ind w:left="504"/>
+        <w:spacing w:after="20"/>
+        <w:ind w:left="259"/>
       </w:pPr>
       <w:r>
         <w:rPr>
           <w:rFonts w:ascii="Calibri" w:hAnsi="Calibri"/>
           <w:b/>
-          <w:i w:val="0"/>
-          <w:color w:val="1E40AF"/>
+          <w:color w:val="0F172A"/>
+          <w:sz w:val="17"/>
+        </w:rPr>
+        <w:t xml:space="preserve">•  </w:t>
+      </w:r>
+      <w:r>
+        <w:rPr>
+          <w:rFonts w:ascii="Calibri" w:hAnsi="Calibri"/>
+          <w:color w:val="1E293B"/>
+          <w:sz w:val="17"/>
+        </w:rPr>
+        <w:t>Refactored legacy .NET stored procedures and wrote automated regression tests using Selenium &amp; Playwright across core SaaS modules.</w:t>
+      </w:r>
+    </w:p>
+    <w:p>
+      <w:pPr>
+        <w:spacing w:after="20"/>
+        <w:ind w:left="259"/>
+      </w:pPr>
+      <w:r>
+        <w:rPr>
+          <w:rFonts w:ascii="Calibri" w:hAnsi="Calibri"/>
+          <w:b/>
+          <w:color w:val="0F172A"/>
+          <w:sz w:val="17"/>
+        </w:rPr>
+        <w:t xml:space="preserve">•  </w:t>
+      </w:r>
+      <w:r>
+        <w:rPr>
+          <w:rFonts w:ascii="Calibri" w:hAnsi="Calibri"/>
+          <w:color w:val="1E293B"/>
+          <w:sz w:val="17"/>
+        </w:rPr>
+        <w:t>Led SonarQube static code analysis across enterprise repositories, fixed security vulnerabilities, configured CI/CD quality gates, and enforced zero-vulnerability deployment standards.</w:t>
+      </w:r>
+    </w:p>
+    <w:p>
+      <w:pPr>
+        <w:keepNext/>
+        <w:spacing w:before="60" w:after="20"/>
+      </w:pPr>
+      <w:r>
+        <w:rPr>
+          <w:rFonts w:ascii="Calibri" w:hAnsi="Calibri"/>
+          <w:b/>
+          <w:color w:val="0F172A"/>
           <w:sz w:val="18"/>
         </w:rPr>
-        <w:t xml:space="preserve">✓  </w:t>
+        <w:t xml:space="preserve">Fullstack Developer | </w:t>
       </w:r>
       <w:r>
         <w:rPr>
           <w:rFonts w:ascii="Calibri" w:hAnsi="Calibri"/>
           <w:b/>
-          <w:i w:val="0"/>
           <w:color w:val="0F172A"/>
-          <w:sz w:val="19"/>
+          <w:sz w:val="18"/>
         </w:rPr>
-        <w:t xml:space="preserve">Automated OEE &amp; HWT Metrics Reporting: </w:t>
+        <w:t>Software House</w:t>
       </w:r>
       <w:r>
         <w:rPr>
           <w:rFonts w:ascii="Calibri" w:hAnsi="Calibri"/>
-          <w:b w:val="0"/>
-          <w:i w:val="0"/>
-          <w:color w:val="0F172A"/>
-          <w:sz w:val="19"/>
+          <w:color w:val="475569"/>
+          <w:sz w:val="17"/>
         </w:rPr>
-        <w:t xml:space="preserve"> Python &amp; Java WhatsApp Bot auto-captured real-time production analytics, directly enabling plant operations to achieve target Overall Equipment Effectiveness (OEE) and Heavy Weight Target (HWT) machine performance.</w:t>
+        <w:t xml:space="preserve"> (Surabaya, Indonesia) | Mar 2022 - Nov 2022</w:t>
       </w:r>
     </w:p>
     <w:p>
       <w:pPr>
-        <w:spacing w:before="140" w:after="50"/>
+        <w:spacing w:after="20"/>
+        <w:ind w:left="259"/>
+      </w:pPr>
+      <w:r>
+        <w:rPr>
+          <w:rFonts w:ascii="Calibri" w:hAnsi="Calibri"/>
+          <w:b/>
+          <w:color w:val="0F172A"/>
+          <w:sz w:val="17"/>
+        </w:rPr>
+        <w:t xml:space="preserve">•  </w:t>
+      </w:r>
+      <w:r>
+        <w:rPr>
+          <w:rFonts w:ascii="Calibri" w:hAnsi="Calibri"/>
+          <w:color w:val="1E293B"/>
+          <w:sz w:val="17"/>
+        </w:rPr>
+        <w:t>Built high-performance web applications using Node.js and Next.js, optimizing complex SQL queries for high-concurrency transactions.</w:t>
+      </w:r>
+    </w:p>
+    <w:p>
+      <w:pPr>
+        <w:spacing w:after="20"/>
+        <w:ind w:left="259"/>
+      </w:pPr>
+      <w:r>
+        <w:rPr>
+          <w:rFonts w:ascii="Calibri" w:hAnsi="Calibri"/>
+          <w:b/>
+          <w:color w:val="0F172A"/>
+          <w:sz w:val="17"/>
+        </w:rPr>
+        <w:t xml:space="preserve">•  </w:t>
+      </w:r>
+      <w:r>
+        <w:rPr>
+          <w:rFonts w:ascii="Calibri" w:hAnsi="Calibri"/>
+          <w:color w:val="1E293B"/>
+          <w:sz w:val="17"/>
+        </w:rPr>
+        <w:t>Recovered and repaired 10,000+ corrupted database records by identifying and patching edge-case business logic bugs.</w:t>
+      </w:r>
+    </w:p>
+    <w:p>
+      <w:pPr>
+        <w:spacing w:after="20"/>
+        <w:ind w:left="259"/>
+      </w:pPr>
+      <w:r>
+        <w:rPr>
+          <w:rFonts w:ascii="Calibri" w:hAnsi="Calibri"/>
+          <w:b/>
+          <w:color w:val="0F172A"/>
+          <w:sz w:val="17"/>
+        </w:rPr>
+        <w:t xml:space="preserve">•  </w:t>
+      </w:r>
+      <w:r>
+        <w:rPr>
+          <w:rFonts w:ascii="Calibri" w:hAnsi="Calibri"/>
+          <w:color w:val="1E293B"/>
+          <w:sz w:val="17"/>
+        </w:rPr>
+        <w:t>Maintained self-hosted Git servers, configured Elasticsearch clusters for log indexing, and upgraded enterprise Java runtimes.</w:t>
+      </w:r>
+    </w:p>
+    <w:p>
+      <w:pPr>
+        <w:spacing w:after="20"/>
+        <w:ind w:left="259"/>
+      </w:pPr>
+      <w:r>
+        <w:rPr>
+          <w:rFonts w:ascii="Calibri" w:hAnsi="Calibri"/>
+          <w:b/>
+          <w:color w:val="0F172A"/>
+          <w:sz w:val="17"/>
+        </w:rPr>
+        <w:t xml:space="preserve">•  </w:t>
+      </w:r>
+      <w:r>
+        <w:rPr>
+          <w:rFonts w:ascii="Calibri" w:hAnsi="Calibri"/>
+          <w:color w:val="1E293B"/>
+          <w:sz w:val="17"/>
+        </w:rPr>
+        <w:t>Resolved recurring high-priority incidents by diagnosing and fixing core backend bottlenecks.</w:t>
+      </w:r>
+    </w:p>
+    <w:p>
+      <w:pPr>
+        <w:keepNext/>
+        <w:spacing w:before="60" w:after="20"/>
+      </w:pPr>
+      <w:r>
+        <w:rPr>
+          <w:rFonts w:ascii="Calibri" w:hAnsi="Calibri"/>
+          <w:b/>
+          <w:color w:val="0F172A"/>
+          <w:sz w:val="18"/>
+        </w:rPr>
+        <w:t xml:space="preserve">Full-Stack Developer | </w:t>
+      </w:r>
+      <w:hyperlink r:id="rId15" w:history="1">
+        <w:r>
+          <w:rPr>
+            <w:color w:val="0F172A"/>
+            <w:u w:val="single"/>
+            <w:b/>
+            <w:sz w:val="18"/>
+            <w:rFonts w:ascii="Calibri" w:hAnsi="Calibri"/>
+          </w:rPr>
+          <w:t>PT Pabrik Kertas Tjiwi Kimia Tbk</w:t>
+        </w:r>
+      </w:hyperlink>
+      <w:r>
+        <w:rPr>
+          <w:rFonts w:ascii="Calibri" w:hAnsi="Calibri"/>
+          <w:color w:val="475569"/>
+          <w:sz w:val="17"/>
+        </w:rPr>
+        <w:t xml:space="preserve"> (Surabaya / Mojokerto, Indonesia) | Sep 2019 - Feb 2022</w:t>
+      </w:r>
+    </w:p>
+    <w:p>
+      <w:pPr>
+        <w:spacing w:after="20"/>
+        <w:ind w:left="259"/>
+      </w:pPr>
+      <w:r>
+        <w:rPr>
+          <w:rFonts w:ascii="Calibri" w:hAnsi="Calibri"/>
+          <w:b/>
+          <w:color w:val="0F172A"/>
+          <w:sz w:val="17"/>
+        </w:rPr>
+        <w:t xml:space="preserve">•  </w:t>
+      </w:r>
+      <w:r>
+        <w:rPr>
+          <w:rFonts w:ascii="Calibri" w:hAnsi="Calibri"/>
+          <w:color w:val="1E293B"/>
+          <w:sz w:val="17"/>
+        </w:rPr>
+        <w:t>Developed manufacturing dashboards and reporting systems for pulp &amp; paper production using .NET Core, C#, ASP Classic, and SQL Server.</w:t>
+      </w:r>
+    </w:p>
+    <w:p>
+      <w:pPr>
+        <w:spacing w:after="20"/>
+        <w:ind w:left="259"/>
+      </w:pPr>
+      <w:r>
+        <w:rPr>
+          <w:rFonts w:ascii="Calibri" w:hAnsi="Calibri"/>
+          <w:b/>
+          <w:color w:val="0F172A"/>
+          <w:sz w:val="17"/>
+        </w:rPr>
+        <w:t xml:space="preserve">•  </w:t>
+      </w:r>
+      <w:r>
+        <w:rPr>
+          <w:rFonts w:ascii="Calibri" w:hAnsi="Calibri"/>
+          <w:color w:val="1E293B"/>
+          <w:sz w:val="17"/>
+        </w:rPr>
+        <w:t>Built an automated WhatsApp alert bot using Python, Java, and Selenium, capturing real-time production metrics for plant OEE and HWT targets.</w:t>
+      </w:r>
+    </w:p>
+    <w:p>
+      <w:pPr>
+        <w:spacing w:after="20"/>
+        <w:ind w:left="259"/>
+      </w:pPr>
+      <w:r>
+        <w:rPr>
+          <w:rFonts w:ascii="Calibri" w:hAnsi="Calibri"/>
+          <w:b/>
+          <w:color w:val="0F172A"/>
+          <w:sz w:val="17"/>
+        </w:rPr>
+        <w:t xml:space="preserve">•  </w:t>
+      </w:r>
+      <w:r>
+        <w:rPr>
+          <w:rFonts w:ascii="Calibri" w:hAnsi="Calibri"/>
+          <w:color w:val="1E293B"/>
+          <w:sz w:val="17"/>
+        </w:rPr>
+        <w:t>Designed and deployed a native Android Barcode Scanner application for warehouse inventory tracking.</w:t>
+      </w:r>
+    </w:p>
+    <w:p>
+      <w:pPr>
+        <w:spacing w:after="20"/>
+        <w:ind w:left="259"/>
+      </w:pPr>
+      <w:r>
+        <w:rPr>
+          <w:rFonts w:ascii="Calibri" w:hAnsi="Calibri"/>
+          <w:b/>
+          <w:color w:val="0F172A"/>
+          <w:sz w:val="17"/>
+        </w:rPr>
+        <w:t xml:space="preserve">•  </w:t>
+      </w:r>
+      <w:r>
+        <w:rPr>
+          <w:rFonts w:ascii="Calibri" w:hAnsi="Calibri"/>
+          <w:color w:val="1E293B"/>
+          <w:sz w:val="17"/>
+        </w:rPr>
+        <w:t>Delivered enterprise internal applications including an automated COVID-19 employee health check-in platform and digital corporate raffle draw systems.</w:t>
+      </w:r>
+    </w:p>
+    <w:p>
+      <w:pPr>
+        <w:keepNext/>
+        <w:spacing w:before="120" w:after="40"/>
         <w:pBdr>
-          <w:bottom w:val="single" w:sz="6" w:space="1" w:color="1E40AF"/>
+          <w:bottom w:val="single" w:sz="6" w:space="1" w:color="CBD5E1"/>
         </w:pBdr>
       </w:pPr>
       <w:r>
         <w:rPr>
           <w:rFonts w:ascii="Calibri" w:hAnsi="Calibri"/>
           <w:b/>
-          <w:i w:val="0"/>
-          <w:color w:val="1E40AF"/>
-          <w:sz w:val="21"/>
+          <w:color w:val="0F172A"/>
+          <w:sz w:val="19"/>
         </w:rPr>
         <w:t>FEATURED PROJECTS &amp; INNOVATIONS</w:t>
       </w:r>
@@ -986,465 +875,813 @@
     <w:p>
       <w:pPr>
         <w:spacing w:after="40"/>
-        <w:ind w:left="216"/>
+        <w:ind w:left="259"/>
       </w:pPr>
       <w:r>
         <w:rPr>
           <w:rFonts w:ascii="Calibri" w:hAnsi="Calibri"/>
           <w:b/>
-          <w:i w:val="0"/>
           <w:color w:val="0F172A"/>
-          <w:sz w:val="19"/>
+          <w:sz w:val="17"/>
         </w:rPr>
-        <w:t>•  AI Portfolio Assistant &amp; Interactive Chatbot</w:t>
+        <w:t xml:space="preserve">•  </w:t>
+      </w:r>
+      <w:hyperlink r:id="rId16" w:history="1">
+        <w:r>
+          <w:rPr>
+            <w:color w:val="0F172A"/>
+            <w:u w:val="single"/>
+            <w:b/>
+            <w:sz w:val="17"/>
+            <w:rFonts w:ascii="Calibri" w:hAnsi="Calibri"/>
+          </w:rPr>
+          <w:t>Qualiv | AI Recruitment SaaS Platform</w:t>
+        </w:r>
+      </w:hyperlink>
+      <w:r>
+        <w:rPr>
+          <w:rFonts w:ascii="Calibri" w:hAnsi="Calibri"/>
+          <w:b/>
+          <w:color w:val="0F172A"/>
+          <w:sz w:val="17"/>
+        </w:rPr>
+        <w:t xml:space="preserve"> (Founder &amp; Lead Architect): </w:t>
       </w:r>
       <w:r>
         <w:rPr>
           <w:rFonts w:ascii="Calibri" w:hAnsi="Calibri"/>
-          <w:b w:val="0"/>
-          <w:i/>
-          <w:color w:val="1E40AF"/>
-          <w:sz w:val="19"/>
+          <w:color w:val="1E293B"/>
+          <w:sz w:val="17"/>
         </w:rPr>
-        <w:t xml:space="preserve"> (andryhuang.com): </w:t>
+        <w:t xml:space="preserve">Built a multi-tenant AI recruitment SaaS featuring automated CV parsing (PDF/DOCX), candidate logic testing, async video interviews, and candidate scoring engine. </w:t>
       </w:r>
       <w:r>
         <w:rPr>
           <w:rFonts w:ascii="Calibri" w:hAnsi="Calibri"/>
-          <w:b w:val="0"/>
-          <w:i w:val="0"/>
+          <w:b/>
           <w:color w:val="0F172A"/>
-          <w:sz w:val="19"/>
+          <w:sz w:val="16"/>
         </w:rPr>
-        <w:t>Interactive RAG-powered portfolio chatbot allowing visitors and recruiters to query career history, tech stack, and project architecture in real time. Tech: Next.js, OpenAI API, Vector Embeddings, Tailwind CSS.</w:t>
+        <w:t xml:space="preserve">Tech Stack: </w:t>
+      </w:r>
+      <w:r>
+        <w:rPr>
+          <w:rFonts w:ascii="Calibri" w:hAnsi="Calibri"/>
+          <w:color w:val="475569"/>
+          <w:sz w:val="16"/>
+        </w:rPr>
+        <w:t>Next.js, NestJS, OpenAI GPT-4o, PostgreSQL, Prisma, BullMQ, Redis Queue, Cloudflare R2, Midtrans</w:t>
       </w:r>
     </w:p>
     <w:p>
       <w:pPr>
         <w:spacing w:after="40"/>
-        <w:ind w:left="216"/>
+        <w:ind w:left="259"/>
       </w:pPr>
       <w:r>
         <w:rPr>
           <w:rFonts w:ascii="Calibri" w:hAnsi="Calibri"/>
           <w:b/>
-          <w:i w:val="0"/>
           <w:color w:val="0F172A"/>
-          <w:sz w:val="19"/>
+          <w:sz w:val="17"/>
         </w:rPr>
-        <w:t>•  Qualiv | AI Recruitment SaaS Platform (Founder &amp; Lead Architect)</w:t>
+        <w:t xml:space="preserve">•  </w:t>
+      </w:r>
+      <w:hyperlink r:id="rId17" w:history="1">
+        <w:r>
+          <w:rPr>
+            <w:color w:val="0F172A"/>
+            <w:u w:val="single"/>
+            <w:b/>
+            <w:sz w:val="17"/>
+            <w:rFonts w:ascii="Calibri" w:hAnsi="Calibri"/>
+          </w:rPr>
+          <w:t>OpenClaw | AI VPS Security &amp; Ops Agent</w:t>
+        </w:r>
+      </w:hyperlink>
+      <w:r>
+        <w:rPr>
+          <w:rFonts w:ascii="Calibri" w:hAnsi="Calibri"/>
+          <w:b/>
+          <w:color w:val="0F172A"/>
+          <w:sz w:val="17"/>
+        </w:rPr>
+        <w:t xml:space="preserve"> (Autonomous AI Agent): </w:t>
       </w:r>
       <w:r>
         <w:rPr>
           <w:rFonts w:ascii="Calibri" w:hAnsi="Calibri"/>
-          <w:b w:val="0"/>
-          <w:i/>
-          <w:color w:val="1E40AF"/>
-          <w:sz w:val="19"/>
+          <w:color w:val="1E293B"/>
+          <w:sz w:val="17"/>
         </w:rPr>
-        <w:t xml:space="preserve"> (qualiv.id): </w:t>
+        <w:t xml:space="preserve">Linux VPS monitoring and security agent featuring LLM log anomaly diagnosis, real-time SSH brute-force detection, Fail2ban auto-mitigation, and Telegram alerts. </w:t>
       </w:r>
       <w:r>
         <w:rPr>
           <w:rFonts w:ascii="Calibri" w:hAnsi="Calibri"/>
-          <w:b w:val="0"/>
-          <w:i w:val="0"/>
+          <w:b/>
           <w:color w:val="0F172A"/>
-          <w:sz w:val="19"/>
+          <w:sz w:val="16"/>
         </w:rPr>
-        <w:t>Built an end-to-end multi-tenant AI recruitment SaaS: LLM CV screening (PDF/Docx), candidate logic tests, real-time AI video &amp; chat interview simulation, and scoring engine. Built with Next.js, NestJS, OpenAI GPT-4o API, PostgreSQL, Prisma, BullMQ + Redis Queue, Cloudflare R2, Midtrans.</w:t>
+        <w:t xml:space="preserve">Tech Stack: </w:t>
+      </w:r>
+      <w:r>
+        <w:rPr>
+          <w:rFonts w:ascii="Calibri" w:hAnsi="Calibri"/>
+          <w:color w:val="475569"/>
+          <w:sz w:val="16"/>
+        </w:rPr>
+        <w:t>Node.js, OpenAI API, Telegram Bot API, Fail2ban, Docker, Linux Security</w:t>
       </w:r>
     </w:p>
     <w:p>
       <w:pPr>
         <w:spacing w:after="40"/>
-        <w:ind w:left="216"/>
+        <w:ind w:left="259"/>
       </w:pPr>
       <w:r>
         <w:rPr>
           <w:rFonts w:ascii="Calibri" w:hAnsi="Calibri"/>
           <w:b/>
-          <w:i w:val="0"/>
           <w:color w:val="0F172A"/>
-          <w:sz w:val="19"/>
+          <w:sz w:val="17"/>
         </w:rPr>
-        <w:t>•  OpenClaw | AI-Powered VPS Security &amp; Ops Agent</w:t>
+        <w:t xml:space="preserve">•  </w:t>
+      </w:r>
+      <w:hyperlink r:id="rId18" w:history="1">
+        <w:r>
+          <w:rPr>
+            <w:color w:val="0F172A"/>
+            <w:u w:val="single"/>
+            <w:b/>
+            <w:sz w:val="17"/>
+            <w:rFonts w:ascii="Calibri" w:hAnsi="Calibri"/>
+          </w:rPr>
+          <w:t>PT Nagamasban | AI Sales Assistant &amp; Catalog</w:t>
+        </w:r>
+      </w:hyperlink>
+      <w:r>
+        <w:rPr>
+          <w:rFonts w:ascii="Calibri" w:hAnsi="Calibri"/>
+          <w:b/>
+          <w:color w:val="0F172A"/>
+          <w:sz w:val="17"/>
+        </w:rPr>
+        <w:t xml:space="preserve"> (Lead AI Architect): </w:t>
       </w:r>
       <w:r>
         <w:rPr>
           <w:rFonts w:ascii="Calibri" w:hAnsi="Calibri"/>
-          <w:b w:val="0"/>
-          <w:i/>
-          <w:color w:val="1E40AF"/>
-          <w:sz w:val="19"/>
+          <w:color w:val="1E293B"/>
+          <w:sz w:val="17"/>
         </w:rPr>
-        <w:t xml:space="preserve"> (Autonomous Agent): </w:t>
+        <w:t xml:space="preserve">AI recommendation engine and sales training tool for a Surabaya tire distributor. Matches tire specifications with vehicle models and customer budgets using OpenAI GPT-4o embeddings and semantic search. </w:t>
       </w:r>
       <w:r>
         <w:rPr>
           <w:rFonts w:ascii="Calibri" w:hAnsi="Calibri"/>
-          <w:b w:val="0"/>
-          <w:i w:val="0"/>
+          <w:b/>
           <w:color w:val="0F172A"/>
-          <w:sz w:val="19"/>
+          <w:sz w:val="16"/>
         </w:rPr>
-        <w:t>Autonomous server security &amp; monitoring agent deployed on remote Linux VPS nodes. Features LLM log anomaly diagnosis, real-time SSH brute-force detection &amp; fail2ban auto-mitigation, and instant Telegram Bot alerts. Tech: Node.js, OpenAI API, Telegram Bot API, Fail2ban, Docker.</w:t>
+        <w:t xml:space="preserve">Tech Stack: </w:t>
+      </w:r>
+      <w:r>
+        <w:rPr>
+          <w:rFonts w:ascii="Calibri" w:hAnsi="Calibri"/>
+          <w:color w:val="475569"/>
+          <w:sz w:val="16"/>
+        </w:rPr>
+        <w:t>Next.js, NestJS, OpenAI API, Vector Embeddings, Tailwind CSS</w:t>
       </w:r>
     </w:p>
     <w:p>
       <w:pPr>
         <w:spacing w:after="40"/>
-        <w:ind w:left="216"/>
+        <w:ind w:left="259"/>
       </w:pPr>
       <w:r>
         <w:rPr>
           <w:rFonts w:ascii="Calibri" w:hAnsi="Calibri"/>
           <w:b/>
-          <w:i w:val="0"/>
           <w:color w:val="0F172A"/>
-          <w:sz w:val="19"/>
+          <w:sz w:val="17"/>
         </w:rPr>
-        <w:t>•  PT Nagamasban | AI Sales Assistant &amp; Catalog</w:t>
+        <w:t xml:space="preserve">•  </w:t>
+      </w:r>
+      <w:hyperlink r:id="rId11" w:history="1">
+        <w:r>
+          <w:rPr>
+            <w:color w:val="0F172A"/>
+            <w:u w:val="single"/>
+            <w:b/>
+            <w:sz w:val="17"/>
+            <w:rFonts w:ascii="Calibri" w:hAnsi="Calibri"/>
+          </w:rPr>
+          <w:t>AI Portfolio Assistant &amp; Interactive Chatbot</w:t>
+        </w:r>
+      </w:hyperlink>
+      <w:r>
+        <w:rPr>
+          <w:rFonts w:ascii="Calibri" w:hAnsi="Calibri"/>
+          <w:b/>
+          <w:color w:val="0F172A"/>
+          <w:sz w:val="17"/>
+        </w:rPr>
+        <w:t xml:space="preserve"> (Creator): </w:t>
       </w:r>
       <w:r>
         <w:rPr>
           <w:rFonts w:ascii="Calibri" w:hAnsi="Calibri"/>
-          <w:b w:val="0"/>
-          <w:i/>
-          <w:color w:val="1E40AF"/>
-          <w:sz w:val="19"/>
+          <w:color w:val="1E293B"/>
+          <w:sz w:val="17"/>
         </w:rPr>
-        <w:t xml:space="preserve"> (katalog.nagamasban.com): </w:t>
+        <w:t xml:space="preserve">RAG-powered portfolio chatbot allowing recruiters and visitors to query professional background, tech stack, and system architecture in real time. </w:t>
       </w:r>
       <w:r>
         <w:rPr>
           <w:rFonts w:ascii="Calibri" w:hAnsi="Calibri"/>
-          <w:b w:val="0"/>
-          <w:i w:val="0"/>
+          <w:b/>
           <w:color w:val="0F172A"/>
-          <w:sz w:val="19"/>
+          <w:sz w:val="16"/>
         </w:rPr>
-        <w:t>AI recommendation engine and sales rep training platform for PT Nagamasban tire distributor in Surabaya, Indonesia. Matched tire specs with vehicle models and budget via OpenAI GPT-4o vector embeddings. Tech: Next.js, NestJS, OpenAI API, Vector Embeddings.</w:t>
+        <w:t xml:space="preserve">Tech Stack: </w:t>
+      </w:r>
+      <w:r>
+        <w:rPr>
+          <w:rFonts w:ascii="Calibri" w:hAnsi="Calibri"/>
+          <w:color w:val="475569"/>
+          <w:sz w:val="16"/>
+        </w:rPr>
+        <w:t>Next.js, OpenAI API, Vector Embeddings, Tailwind CSS</w:t>
       </w:r>
     </w:p>
     <w:p>
       <w:pPr>
         <w:spacing w:after="40"/>
-        <w:ind w:left="216"/>
+        <w:ind w:left="259"/>
       </w:pPr>
       <w:r>
         <w:rPr>
           <w:rFonts w:ascii="Calibri" w:hAnsi="Calibri"/>
           <w:b/>
-          <w:i w:val="0"/>
           <w:color w:val="0F172A"/>
-          <w:sz w:val="19"/>
+          <w:sz w:val="17"/>
         </w:rPr>
-        <w:t>•  AI Stock Portfolio Manager</w:t>
+        <w:t xml:space="preserve">•  </w:t>
+      </w:r>
+      <w:hyperlink r:id="rId19" w:history="1">
+        <w:r>
+          <w:rPr>
+            <w:color w:val="0F172A"/>
+            <w:u w:val="single"/>
+            <w:b/>
+            <w:sz w:val="17"/>
+            <w:rFonts w:ascii="Calibri" w:hAnsi="Calibri"/>
+          </w:rPr>
+          <w:t>Retail &amp; Enterprise Custom ERP / POS Systems</w:t>
+        </w:r>
+      </w:hyperlink>
+      <w:r>
+        <w:rPr>
+          <w:rFonts w:ascii="Calibri" w:hAnsi="Calibri"/>
+          <w:b/>
+          <w:color w:val="0F172A"/>
+          <w:sz w:val="17"/>
+        </w:rPr>
+        <w:t xml:space="preserve"> (Fullstack Architect): </w:t>
       </w:r>
       <w:r>
         <w:rPr>
           <w:rFonts w:ascii="Calibri" w:hAnsi="Calibri"/>
-          <w:b w:val="0"/>
-          <w:i/>
-          <w:color w:val="1E40AF"/>
-          <w:sz w:val="19"/>
+          <w:color w:val="1E293B"/>
+          <w:sz w:val="17"/>
         </w:rPr>
-        <w:t xml:space="preserve"> (Personal AI Project): </w:t>
+        <w:t xml:space="preserve">Delivered custom solutions for retail enterprises: (1) Cahaya Terang Tire ERP (Double-entry A/R &amp; A/P Ledger), (2) Wijaya Mas Jewelry POS (RFID Hardware integration), (3) Knit and Cro E-Commerce (Midtrans &amp; RajaOngkir API), and (4) Tiga Putra Grocery POS (FIFO Expiry tracking). </w:t>
       </w:r>
       <w:r>
         <w:rPr>
           <w:rFonts w:ascii="Calibri" w:hAnsi="Calibri"/>
-          <w:b w:val="0"/>
-          <w:i w:val="0"/>
+          <w:b/>
           <w:color w:val="0F172A"/>
-          <w:sz w:val="19"/>
+          <w:sz w:val="16"/>
         </w:rPr>
-        <w:t>Personal stock portfolio AI assistant with holdings tracking, financial report AI summarization, risk exposure calculator, and LLM analysis chatbot. Tech: Python FastAPI, Next.js, OpenAI GPT-4o, PostgreSQL, Lightweight Charts.</w:t>
+        <w:t xml:space="preserve">Tech Stack: </w:t>
+      </w:r>
+      <w:r>
+        <w:rPr>
+          <w:rFonts w:ascii="Calibri" w:hAnsi="Calibri"/>
+          <w:color w:val="475569"/>
+          <w:sz w:val="16"/>
+        </w:rPr>
+        <w:t>Laravel, Livewire, MySQL, RFID Integration, Payment Gateway</w:t>
       </w:r>
     </w:p>
     <w:p>
       <w:pPr>
         <w:spacing w:after="40"/>
-        <w:ind w:left="216"/>
+        <w:ind w:left="259"/>
       </w:pPr>
       <w:r>
         <w:rPr>
           <w:rFonts w:ascii="Calibri" w:hAnsi="Calibri"/>
           <w:b/>
-          <w:i w:val="0"/>
           <w:color w:val="0F172A"/>
-          <w:sz w:val="19"/>
+          <w:sz w:val="17"/>
         </w:rPr>
-        <w:t>•  Retail &amp; Enterprise Systems (Client Solutions)</w:t>
+        <w:t xml:space="preserve">•  </w:t>
       </w:r>
       <w:r>
         <w:rPr>
           <w:rFonts w:ascii="Calibri" w:hAnsi="Calibri"/>
-          <w:b w:val="0"/>
-          <w:i/>
-          <w:color w:val="1E40AF"/>
-          <w:sz w:val="19"/>
+          <w:b/>
+          <w:color w:val="0F172A"/>
+          <w:sz w:val="17"/>
         </w:rPr>
-        <w:t xml:space="preserve"> (Client Solutions): </w:t>
+        <w:t>CG Home Sharing &amp; Interactive Quiz Platforms</w:t>
       </w:r>
       <w:r>
         <w:rPr>
           <w:rFonts w:ascii="Calibri" w:hAnsi="Calibri"/>
-          <w:b w:val="0"/>
-          <w:i w:val="0"/>
+          <w:b/>
           <w:color w:val="0F172A"/>
-          <w:sz w:val="19"/>
+          <w:sz w:val="17"/>
         </w:rPr>
-        <w:t>Built custom enterprise systems for client businesses: (1) Cahaya Terang Tire ERP (Tire Store, Surabaya: Double-entry A/R &amp; A/P Ledger), (2) Wijaya Mas Jewelry POS (Jewelry Store, Pluit Jakarta: RFID Hardware Scanner integration), (3) Knit and Cro E-Commerce (Yarn Store, Pluit Jakarta: knitandcro.com - Midtrans &amp; RajaOngkir API), and (4) Tiga Putra Grocery POS (Grocery Store, Jombang: FIFO Expiry tracking). Tech: Laravel, Livewire, MySQL.</w:t>
+        <w:t xml:space="preserve"> (Community Initiative Lead): </w:t>
+      </w:r>
+      <w:r>
+        <w:rPr>
+          <w:rFonts w:ascii="Calibri" w:hAnsi="Calibri"/>
+          <w:color w:val="1E293B"/>
+          <w:sz w:val="17"/>
+        </w:rPr>
+        <w:t xml:space="preserve">Built community platforms including an Airbnb-style room booking system with Leaflet GIS maps and surveyor inspection workflows, and a real-time WebSocket online quiz and logic testing platform. </w:t>
+      </w:r>
+      <w:r>
+        <w:rPr>
+          <w:rFonts w:ascii="Calibri" w:hAnsi="Calibri"/>
+          <w:b/>
+          <w:color w:val="0F172A"/>
+          <w:sz w:val="16"/>
+        </w:rPr>
+        <w:t xml:space="preserve">Tech Stack: </w:t>
+      </w:r>
+      <w:r>
+        <w:rPr>
+          <w:rFonts w:ascii="Calibri" w:hAnsi="Calibri"/>
+          <w:color w:val="475569"/>
+          <w:sz w:val="16"/>
+        </w:rPr>
+        <w:t>Next.js, NestJS, PostgreSQL, Prisma, Leaflet GIS, WebSockets</w:t>
       </w:r>
     </w:p>
     <w:p>
       <w:pPr>
-        <w:spacing w:after="40"/>
-        <w:ind w:left="216"/>
-      </w:pPr>
-      <w:r>
-        <w:rPr>
-          <w:rFonts w:ascii="Calibri" w:hAnsi="Calibri"/>
-          <w:b/>
-          <w:i w:val="0"/>
-          <w:color w:val="0F172A"/>
-          <w:sz w:val="19"/>
-        </w:rPr>
-        <w:t>•  CG Home Sharing Platform (Community Initiative)</w:t>
-      </w:r>
-      <w:r>
-        <w:rPr>
-          <w:rFonts w:ascii="Calibri" w:hAnsi="Calibri"/>
-          <w:b w:val="0"/>
-          <w:i/>
-          <w:color w:val="1E40AF"/>
-          <w:sz w:val="19"/>
-        </w:rPr>
-        <w:t xml:space="preserve"> (Volunteer Platform): </w:t>
-      </w:r>
-      <w:r>
-        <w:rPr>
-          <w:rFonts w:ascii="Calibri" w:hAnsi="Calibri"/>
-          <w:b w:val="0"/>
-          <w:i w:val="0"/>
-          <w:color w:val="0F172A"/>
-          <w:sz w:val="19"/>
-        </w:rPr>
-        <w:t>Airbnb-style Connect Group room booking platform for church community organizations featuring Leaflet GIS maps, surveyor inspection workflow, and SSO verification. Tech: Next.js, NestJS, PostgreSQL, Prisma, Leaflet GIS.</w:t>
-      </w:r>
-    </w:p>
-    <w:p>
-      <w:pPr>
-        <w:spacing w:after="40"/>
-        <w:ind w:left="216"/>
-      </w:pPr>
-      <w:r>
-        <w:rPr>
-          <w:rFonts w:ascii="Calibri" w:hAnsi="Calibri"/>
-          <w:b/>
-          <w:i w:val="0"/>
-          <w:color w:val="0F172A"/>
-          <w:sz w:val="19"/>
-        </w:rPr>
-        <w:t>•  Interactive Quiz &amp; Logic Test App (Community Initiative)</w:t>
-      </w:r>
-      <w:r>
-        <w:rPr>
-          <w:rFonts w:ascii="Calibri" w:hAnsi="Calibri"/>
-          <w:b w:val="0"/>
-          <w:i/>
-          <w:color w:val="1E40AF"/>
-          <w:sz w:val="19"/>
-        </w:rPr>
-        <w:t xml:space="preserve"> (Volunteer Platform): </w:t>
-      </w:r>
-      <w:r>
-        <w:rPr>
-          <w:rFonts w:ascii="Calibri" w:hAnsi="Calibri"/>
-          <w:b w:val="0"/>
-          <w:i w:val="0"/>
-          <w:color w:val="0F172A"/>
-          <w:sz w:val="19"/>
-        </w:rPr>
-        <w:t>Real-time online quiz and logic testing platform built for community engagement, featuring real-time WebSocket scoring engines and participant performance analytics. Tech: Next.js, NestJS, PostgreSQL, WebSockets.</w:t>
-      </w:r>
-    </w:p>
-    <w:p>
-      <w:pPr>
-        <w:spacing w:before="140" w:after="50"/>
+        <w:keepNext/>
+        <w:spacing w:before="120" w:after="40"/>
         <w:pBdr>
-          <w:bottom w:val="single" w:sz="6" w:space="1" w:color="1E40AF"/>
+          <w:bottom w:val="single" w:sz="6" w:space="1" w:color="CBD5E1"/>
         </w:pBdr>
       </w:pPr>
       <w:r>
         <w:rPr>
           <w:rFonts w:ascii="Calibri" w:hAnsi="Calibri"/>
           <w:b/>
-          <w:i w:val="0"/>
-          <w:color w:val="1E40AF"/>
-          <w:sz w:val="21"/>
+          <w:color w:val="0F172A"/>
+          <w:sz w:val="19"/>
         </w:rPr>
         <w:t>EDUCATION</w:t>
       </w:r>
     </w:p>
     <w:p>
       <w:pPr>
-        <w:spacing w:after="30"/>
+        <w:spacing w:after="20"/>
       </w:pPr>
       <w:r>
         <w:rPr>
           <w:rFonts w:ascii="Calibri" w:hAnsi="Calibri"/>
           <w:b/>
-          <w:i w:val="0"/>
-          <w:color w:val="0F172A"/>
-          <w:sz w:val="20"/>
+          <w:color w:val="1E293B"/>
+          <w:sz w:val="17"/>
         </w:rPr>
-        <w:t>Bachelor of Science in Computer Science (S1 Teknik Informatika)</w:t>
+        <w:t xml:space="preserve">Bachelor of Science in Computer Science (S1 Teknik Informatika) | </w:t>
       </w:r>
+      <w:hyperlink r:id="rId20" w:history="1">
+        <w:r>
+          <w:rPr>
+            <w:color w:val="1E293B"/>
+            <w:u w:val="single"/>
+            <w:b/>
+            <w:sz w:val="17"/>
+            <w:rFonts w:ascii="Calibri" w:hAnsi="Calibri"/>
+          </w:rPr>
+          <w:t>University of Surabaya (UBAYA)</w:t>
+        </w:r>
+      </w:hyperlink>
       <w:r>
         <w:rPr>
           <w:rFonts w:ascii="Calibri" w:hAnsi="Calibri"/>
-          <w:b w:val="0"/>
-          <w:i w:val="0"/>
-          <w:color w:val="475569"/>
-          <w:sz w:val="20"/>
+          <w:color w:val="1E293B"/>
+          <w:sz w:val="17"/>
         </w:rPr>
-        <w:t xml:space="preserve"> | University of Surabaya (UBAYA), Indonesia (2015 - 2019)</w:t>
-      </w:r>
-      <w:r>
-        <w:rPr>
-          <w:rFonts w:ascii="Calibri" w:hAnsi="Calibri"/>
-          <w:b/>
-          <w:i w:val="0"/>
-          <w:color w:val="1E40AF"/>
-          <w:sz w:val="19"/>
-        </w:rPr>
-        <w:t xml:space="preserve"> | GPA: 3.60 / 4.00 (Cum Laude)</w:t>
+        <w:t>, Indonesia (2015 - 2019) | GPA: 3.60 / 4.00 (Cum Laude)</w:t>
       </w:r>
     </w:p>
     <w:p>
       <w:pPr>
-        <w:spacing w:before="140" w:after="50"/>
+        <w:keepNext/>
+        <w:spacing w:before="120" w:after="40"/>
         <w:pBdr>
-          <w:bottom w:val="single" w:sz="6" w:space="1" w:color="1E40AF"/>
+          <w:bottom w:val="single" w:sz="6" w:space="1" w:color="CBD5E1"/>
         </w:pBdr>
       </w:pPr>
       <w:r>
         <w:rPr>
           <w:rFonts w:ascii="Calibri" w:hAnsi="Calibri"/>
           <w:b/>
-          <w:i w:val="0"/>
-          <w:color w:val="1E40AF"/>
-          <w:sz w:val="21"/>
+          <w:color w:val="0F172A"/>
+          <w:sz w:val="19"/>
         </w:rPr>
         <w:t>CERTIFICATIONS</w:t>
       </w:r>
     </w:p>
     <w:p>
       <w:pPr>
-        <w:spacing w:after="30"/>
+        <w:spacing w:after="20"/>
       </w:pPr>
       <w:r>
         <w:rPr>
           <w:rFonts w:ascii="Calibri" w:hAnsi="Calibri"/>
           <w:b/>
-          <w:i w:val="0"/>
           <w:color w:val="0F172A"/>
-          <w:sz w:val="19"/>
+          <w:sz w:val="17"/>
         </w:rPr>
-        <w:t xml:space="preserve">•  Anthropic AI Certifications: </w:t>
+        <w:t xml:space="preserve">•  </w:t>
       </w:r>
+      <w:hyperlink r:id="rId21" w:history="1">
+        <w:r>
+          <w:rPr>
+            <w:color w:val="0F172A"/>
+            <w:u w:val="single"/>
+            <w:b/>
+            <w:sz w:val="17"/>
+            <w:rFonts w:ascii="Calibri" w:hAnsi="Calibri"/>
+          </w:rPr>
+          <w:t>Anthropic AI Certifications Suite (9 Certifications)</w:t>
+        </w:r>
+      </w:hyperlink>
       <w:r>
         <w:rPr>
           <w:rFonts w:ascii="Calibri" w:hAnsi="Calibri"/>
-          <w:b w:val="0"/>
-          <w:i w:val="0"/>
-          <w:color w:val="0F172A"/>
-          <w:sz w:val="19"/>
+          <w:color w:val="1E293B"/>
+          <w:sz w:val="16"/>
         </w:rPr>
-        <w:t>Building with Claude API, Model Context Protocol (MCP), Claude Code &amp; AI Subagents (Anthropic, 2026)</w:t>
+        <w:t xml:space="preserve"> (Anthropic, 2026): </w:t>
       </w:r>
+      <w:hyperlink r:id="rId22" w:history="1">
+        <w:r>
+          <w:rPr>
+            <w:color w:val="1E3A8A"/>
+            <w:u w:val="single"/>
+            <w:sz w:val="16"/>
+            <w:rFonts w:ascii="Calibri" w:hAnsi="Calibri"/>
+          </w:rPr>
+          <w:t>Building with Claude API</w:t>
+        </w:r>
+      </w:hyperlink>
+      <w:r>
+        <w:rPr>
+          <w:rFonts w:ascii="Calibri" w:hAnsi="Calibri"/>
+          <w:color w:val="475569"/>
+          <w:sz w:val="16"/>
+        </w:rPr>
+        <w:t xml:space="preserve"> | </w:t>
+      </w:r>
+      <w:hyperlink r:id="rId23" w:history="1">
+        <w:r>
+          <w:rPr>
+            <w:color w:val="1E3A8A"/>
+            <w:u w:val="single"/>
+            <w:sz w:val="16"/>
+            <w:rFonts w:ascii="Calibri" w:hAnsi="Calibri"/>
+          </w:rPr>
+          <w:t>Claude Code in Action</w:t>
+        </w:r>
+      </w:hyperlink>
+      <w:r>
+        <w:rPr>
+          <w:rFonts w:ascii="Calibri" w:hAnsi="Calibri"/>
+          <w:color w:val="475569"/>
+          <w:sz w:val="16"/>
+        </w:rPr>
+        <w:t xml:space="preserve"> | </w:t>
+      </w:r>
+      <w:hyperlink r:id="rId24" w:history="1">
+        <w:r>
+          <w:rPr>
+            <w:color w:val="1E3A8A"/>
+            <w:u w:val="single"/>
+            <w:sz w:val="16"/>
+            <w:rFonts w:ascii="Calibri" w:hAnsi="Calibri"/>
+          </w:rPr>
+          <w:t>Intro to MCP</w:t>
+        </w:r>
+      </w:hyperlink>
+      <w:r>
+        <w:rPr>
+          <w:rFonts w:ascii="Calibri" w:hAnsi="Calibri"/>
+          <w:color w:val="475569"/>
+          <w:sz w:val="16"/>
+        </w:rPr>
+        <w:t xml:space="preserve"> | </w:t>
+      </w:r>
+      <w:hyperlink r:id="rId25" w:history="1">
+        <w:r>
+          <w:rPr>
+            <w:color w:val="1E3A8A"/>
+            <w:u w:val="single"/>
+            <w:sz w:val="16"/>
+            <w:rFonts w:ascii="Calibri" w:hAnsi="Calibri"/>
+          </w:rPr>
+          <w:t>MCP Advanced</w:t>
+        </w:r>
+      </w:hyperlink>
+      <w:r>
+        <w:rPr>
+          <w:rFonts w:ascii="Calibri" w:hAnsi="Calibri"/>
+          <w:color w:val="475569"/>
+          <w:sz w:val="16"/>
+        </w:rPr>
+        <w:t xml:space="preserve"> | </w:t>
+      </w:r>
+      <w:hyperlink r:id="rId26" w:history="1">
+        <w:r>
+          <w:rPr>
+            <w:color w:val="1E3A8A"/>
+            <w:u w:val="single"/>
+            <w:sz w:val="16"/>
+            <w:rFonts w:ascii="Calibri" w:hAnsi="Calibri"/>
+          </w:rPr>
+          <w:t>Agent Skills</w:t>
+        </w:r>
+      </w:hyperlink>
+      <w:r>
+        <w:rPr>
+          <w:rFonts w:ascii="Calibri" w:hAnsi="Calibri"/>
+          <w:color w:val="475569"/>
+          <w:sz w:val="16"/>
+        </w:rPr>
+        <w:t xml:space="preserve"> | </w:t>
+      </w:r>
+      <w:hyperlink r:id="rId27" w:history="1">
+        <w:r>
+          <w:rPr>
+            <w:color w:val="1E3A8A"/>
+            <w:u w:val="single"/>
+            <w:sz w:val="16"/>
+            <w:rFonts w:ascii="Calibri" w:hAnsi="Calibri"/>
+          </w:rPr>
+          <w:t>Subagents</w:t>
+        </w:r>
+      </w:hyperlink>
+      <w:r>
+        <w:rPr>
+          <w:rFonts w:ascii="Calibri" w:hAnsi="Calibri"/>
+          <w:color w:val="475569"/>
+          <w:sz w:val="16"/>
+        </w:rPr>
+        <w:t xml:space="preserve"> | </w:t>
+      </w:r>
+      <w:hyperlink r:id="rId28" w:history="1">
+        <w:r>
+          <w:rPr>
+            <w:color w:val="1E3A8A"/>
+            <w:u w:val="single"/>
+            <w:sz w:val="16"/>
+            <w:rFonts w:ascii="Calibri" w:hAnsi="Calibri"/>
+          </w:rPr>
+          <w:t>AI Capabilities &amp; Limitations</w:t>
+        </w:r>
+      </w:hyperlink>
+      <w:r>
+        <w:rPr>
+          <w:rFonts w:ascii="Calibri" w:hAnsi="Calibri"/>
+          <w:color w:val="475569"/>
+          <w:sz w:val="16"/>
+        </w:rPr>
+        <w:t xml:space="preserve"> | </w:t>
+      </w:r>
+      <w:hyperlink r:id="rId29" w:history="1">
+        <w:r>
+          <w:rPr>
+            <w:color w:val="1E3A8A"/>
+            <w:u w:val="single"/>
+            <w:sz w:val="16"/>
+            <w:rFonts w:ascii="Calibri" w:hAnsi="Calibri"/>
+          </w:rPr>
+          <w:t>Claude Cowork</w:t>
+        </w:r>
+      </w:hyperlink>
+      <w:r>
+        <w:rPr>
+          <w:rFonts w:ascii="Calibri" w:hAnsi="Calibri"/>
+          <w:color w:val="475569"/>
+          <w:sz w:val="16"/>
+        </w:rPr>
+        <w:t xml:space="preserve"> | </w:t>
+      </w:r>
+      <w:hyperlink r:id="rId30" w:history="1">
+        <w:r>
+          <w:rPr>
+            <w:color w:val="1E3A8A"/>
+            <w:u w:val="single"/>
+            <w:sz w:val="16"/>
+            <w:rFonts w:ascii="Calibri" w:hAnsi="Calibri"/>
+          </w:rPr>
+          <w:t>Claude 101</w:t>
+        </w:r>
+      </w:hyperlink>
     </w:p>
     <w:p>
       <w:pPr>
-        <w:spacing w:after="30"/>
+        <w:spacing w:after="20"/>
       </w:pPr>
       <w:r>
         <w:rPr>
           <w:rFonts w:ascii="Calibri" w:hAnsi="Calibri"/>
           <w:b/>
-          <w:i w:val="0"/>
           <w:color w:val="0F172A"/>
-          <w:sz w:val="19"/>
+          <w:sz w:val="17"/>
         </w:rPr>
-        <w:t xml:space="preserve">•  AI Agents with Model Context Protocol: </w:t>
+        <w:t xml:space="preserve">•  </w:t>
       </w:r>
+      <w:hyperlink r:id="rId31" w:history="1">
+        <w:r>
+          <w:rPr>
+            <w:color w:val="0F172A"/>
+            <w:u w:val="single"/>
+            <w:b/>
+            <w:sz w:val="17"/>
+            <w:rFonts w:ascii="Calibri" w:hAnsi="Calibri"/>
+          </w:rPr>
+          <w:t>AI Agents with Model Context Protocol</w:t>
+        </w:r>
+      </w:hyperlink>
       <w:r>
         <w:rPr>
           <w:rFonts w:ascii="Calibri" w:hAnsi="Calibri"/>
-          <w:b w:val="0"/>
-          <w:i w:val="0"/>
-          <w:color w:val="0F172A"/>
-          <w:sz w:val="19"/>
+          <w:color w:val="1E293B"/>
+          <w:sz w:val="17"/>
         </w:rPr>
-        <w:t>Vanderbilt University (Coursera, 2026)</w:t>
+        <w:t xml:space="preserve">: </w:t>
+      </w:r>
+      <w:hyperlink r:id="rId32" w:history="1">
+        <w:r>
+          <w:rPr>
+            <w:color w:val="1E293B"/>
+            <w:u w:val="single"/>
+            <w:b/>
+            <w:sz w:val="17"/>
+            <w:rFonts w:ascii="Calibri" w:hAnsi="Calibri"/>
+          </w:rPr>
+          <w:t>Vanderbilt University</w:t>
+        </w:r>
+      </w:hyperlink>
+      <w:r>
+        <w:rPr>
+          <w:rFonts w:ascii="Calibri" w:hAnsi="Calibri"/>
+          <w:color w:val="1E293B"/>
+          <w:sz w:val="17"/>
+        </w:rPr>
+        <w:t xml:space="preserve"> (</w:t>
+      </w:r>
+      <w:hyperlink r:id="rId31" w:history="1">
+        <w:r>
+          <w:rPr>
+            <w:color w:val="1E3A8A"/>
+            <w:u w:val="single"/>
+            <w:sz w:val="17"/>
+            <w:rFonts w:ascii="Calibri" w:hAnsi="Calibri"/>
+          </w:rPr>
+          <w:t>Coursera Verification</w:t>
+        </w:r>
+      </w:hyperlink>
+      <w:r>
+        <w:rPr>
+          <w:rFonts w:ascii="Calibri" w:hAnsi="Calibri"/>
+          <w:color w:val="1E293B"/>
+          <w:sz w:val="17"/>
+        </w:rPr>
+        <w:t>, 2026). Hands-on implementation of autonomous agent architecture, tool use, and MCP server-client protocols.</w:t>
       </w:r>
     </w:p>
     <w:p>
       <w:pPr>
-        <w:spacing w:after="30"/>
+        <w:spacing w:after="20"/>
       </w:pPr>
       <w:r>
         <w:rPr>
           <w:rFonts w:ascii="Calibri" w:hAnsi="Calibri"/>
           <w:b/>
-          <w:i w:val="0"/>
           <w:color w:val="0F172A"/>
-          <w:sz w:val="19"/>
+          <w:sz w:val="17"/>
         </w:rPr>
-        <w:t xml:space="preserve">•  Software Architecture &amp; Design of Modern Large Scale Systems: </w:t>
+        <w:t xml:space="preserve">•  </w:t>
       </w:r>
+      <w:hyperlink r:id="rId33" w:history="1">
+        <w:r>
+          <w:rPr>
+            <w:color w:val="0F172A"/>
+            <w:u w:val="single"/>
+            <w:b/>
+            <w:sz w:val="17"/>
+            <w:rFonts w:ascii="Calibri" w:hAnsi="Calibri"/>
+          </w:rPr>
+          <w:t>Software Architecture &amp; Design of Modern Large Scale Systems</w:t>
+        </w:r>
+      </w:hyperlink>
       <w:r>
         <w:rPr>
           <w:rFonts w:ascii="Calibri" w:hAnsi="Calibri"/>
-          <w:b w:val="0"/>
-          <w:i w:val="0"/>
-          <w:color w:val="0F172A"/>
-          <w:sz w:val="19"/>
+          <w:color w:val="1E293B"/>
+          <w:sz w:val="17"/>
         </w:rPr>
-        <w:t>Udemy (2026)</w:t>
+        <w:t xml:space="preserve">: </w:t>
+      </w:r>
+      <w:hyperlink r:id="rId34" w:history="1">
+        <w:r>
+          <w:rPr>
+            <w:color w:val="1E293B"/>
+            <w:u w:val="single"/>
+            <w:b/>
+            <w:sz w:val="17"/>
+            <w:rFonts w:ascii="Calibri" w:hAnsi="Calibri"/>
+          </w:rPr>
+          <w:t>Udemy</w:t>
+        </w:r>
+      </w:hyperlink>
+      <w:r>
+        <w:rPr>
+          <w:rFonts w:ascii="Calibri" w:hAnsi="Calibri"/>
+          <w:color w:val="1E293B"/>
+          <w:sz w:val="17"/>
+        </w:rPr>
+        <w:t xml:space="preserve"> (</w:t>
+      </w:r>
+      <w:hyperlink r:id="rId33" w:history="1">
+        <w:r>
+          <w:rPr>
+            <w:color w:val="1E3A8A"/>
+            <w:u w:val="single"/>
+            <w:sz w:val="17"/>
+            <w:rFonts w:ascii="Calibri" w:hAnsi="Calibri"/>
+          </w:rPr>
+          <w:t>Udemy Verification</w:t>
+        </w:r>
+      </w:hyperlink>
+      <w:r>
+        <w:rPr>
+          <w:rFonts w:ascii="Calibri" w:hAnsi="Calibri"/>
+          <w:color w:val="1E293B"/>
+          <w:sz w:val="17"/>
+        </w:rPr>
+        <w:t>, 2026). High-throughput distributed systems, microservices design, caching strategies, and fault-tolerant architecture.</w:t>
       </w:r>
     </w:p>
     <w:p>
       <w:pPr>
-        <w:spacing w:after="80"/>
+        <w:keepNext/>
+        <w:spacing w:before="120" w:after="40"/>
+        <w:pBdr>
+          <w:bottom w:val="single" w:sz="6" w:space="1" w:color="CBD5E1"/>
+        </w:pBdr>
       </w:pPr>
       <w:r>
         <w:rPr>
           <w:rFonts w:ascii="Calibri" w:hAnsi="Calibri"/>
           <w:b/>
-          <w:i w:val="0"/>
           <w:color w:val="0F172A"/>
           <w:sz w:val="19"/>
         </w:rPr>
-        <w:t xml:space="preserve">Languages: </w:t>
+        <w:t>LANGUAGES</w:t>
       </w:r>
+    </w:p>
+    <w:p>
+      <w:pPr>
+        <w:spacing w:after="20"/>
+      </w:pPr>
       <w:r>
         <w:rPr>
           <w:rFonts w:ascii="Calibri" w:hAnsi="Calibri"/>
-          <w:b w:val="0"/>
-          <w:i w:val="0"/>
-          <w:color w:val="0F172A"/>
-          <w:sz w:val="19"/>
+          <w:color w:val="1E293B"/>
+          <w:sz w:val="17"/>
         </w:rPr>
-        <w:t>English (Professional Working Proficiency), Indonesian (Native)</w:t>
+        <w:t>•  English (Professional Working Proficiency), Indonesian (Native Proficiency)</w:t>
       </w:r>
     </w:p>
     <w:sectPr>
       <w:pgSz w:w="12240" w:h="15840"/>
-      <w:pgMar w:top="576" w:right="576" w:bottom="576" w:left="576" w:header="720" w:footer="720" w:gutter="0"/>
+      <w:pgMar w:top="648" w:right="864" w:bottom="648" w:left="864" w:header="720" w:footer="720" w:gutter="0"/>
       <w:cols w:space="720"/>
       <w:docGrid w:linePitch="360"/>
     </w:sectPr>

</xml_diff>

<commit_message>
feat: sync portfolio with CV v2 and add Wonderful Works project
- Add Wonderful Works (wwconstruction.id) project with screenshots, featured
  on the home page; describe only features that exist in its codebase
- Align About experience with the CV: MRI first, freelance 2021 - Present,
  Software House as Java / Spring Boot / Oracle TMS
- Rewrite Hero, Manifesto, FAQ, and project copy in plain, specific language
- Fix inaccurate claims: portfolio chatbot uses DeepSeek with a curated
  prompt (no RAG), Nagamasban uses OpenAI embeddings + pgvector, WhatsApp
  bot sends scheduled snapshots, 20+ projects instead of 30+
- Remove unmeasured metrics (25% upsell, 95% stock gap, 40% default risk,
  2h -> 3min RFID audit)
- SEO: one job title across metadata, drop stale worksFor, keep FAQ JSON-LD
  identical to the visible FAQ
- Replace dated "Claude 3.7" references with "Anthropic Claude API"
- Update downloadable CV (PDF/DOCX)

Co-Authored-By: Claude Opus 5.5 <noreply@anthropic.com>
</commit_message>
<xml_diff>
--- a/public/Andry_Huang_CV.docx
+++ b/public/Andry_Huang_CV.docx
@@ -198,7 +198,7 @@
           <w:color w:val="1E293B"/>
           <w:sz w:val="18"/>
         </w:rPr>
-        <w:t>Senior Fullstack &amp; AI Engineer with 7+ years of experience architecting and building enterprise SaaS platforms, distributed systems, and production AI tools. Core stack: .NET Core, Next.js, Node.js, NestJS, SQL performance tuning, and LLM RAG pipelines. Proven background delivering secure, high-concurrency architectures with international remote engineering teams.</w:t>
+        <w:t>Senior Fullstack &amp; AI Engineer with 7+ years of experience. Spent 3+ years remote at MRI Software (Singapore) building enterprise leasing and tenant-management SaaS, including production RAG features on OpenAI and pgvector. Founded Qualiv, an AI recruitment SaaS, and built ERP, POS, and CMS systems for businesses in Surabaya. Core stack: .NET Core, Next.js, Node.js, NestJS, SQL tuning, and LLM/RAG.</w:t>
       </w:r>
     </w:p>
     <w:p>
@@ -485,7 +485,7 @@
           <w:color w:val="475569"/>
           <w:sz w:val="17"/>
         </w:rPr>
-        <w:t xml:space="preserve"> (Singapore (Remote)) | Nov 2022 - Mar 2026</w:t>
+        <w:t xml:space="preserve"> (Singapore, Remote) | Nov 2022 - Mar 2026</w:t>
       </w:r>
     </w:p>
     <w:p>
@@ -508,7 +508,7 @@
           <w:color w:val="1E293B"/>
           <w:sz w:val="17"/>
         </w:rPr>
-        <w:t>Scaled enterprise SaaS platforms (Anacle Simplicity &amp; SMRT Tenant Management System), supporting mall tender submissions, space leasing, tenant applications, and day-to-day operations using .NET Core, .NET Framework 4.8, Next.js, and NestJS.</w:t>
+        <w:t>Built features for Anacle Simplicity and the SMRT Tenant Management System through go-live: mall tender submissions, space leasing, tenant applications, and daily operations. Stack: .NET Core, .NET Framework 4.8, Next.js, NestJS.</w:t>
       </w:r>
     </w:p>
     <w:p>
@@ -531,7 +531,7 @@
           <w:color w:val="1E293B"/>
           <w:sz w:val="17"/>
         </w:rPr>
-        <w:t>Deployed production RAG pipelines using OpenAI API and PostgreSQL (pgvector) for semantic document retrieval, search, and automated executive reporting.</w:t>
+        <w:t>Shipped production RAG pipelines on the OpenAI API and PostgreSQL (pgvector) for semantic document search and automated executive reports.</w:t>
       </w:r>
     </w:p>
     <w:p>
@@ -554,7 +554,7 @@
           <w:color w:val="1E293B"/>
           <w:sz w:val="17"/>
         </w:rPr>
-        <w:t>Built a document migration microservice syncing 100,000+ enterprise files to SharePoint Graph API, AWS S3, and Azure Blob Storage with RBAC security and audit logging.</w:t>
+        <w:t>Wrote a microservice that migrated 100,000+ files to SharePoint (Graph API), AWS S3, and Azure Blob Storage, with RBAC and audit logging.</w:t>
       </w:r>
     </w:p>
     <w:p>
@@ -577,7 +577,7 @@
           <w:color w:val="1E293B"/>
           <w:sz w:val="17"/>
         </w:rPr>
-        <w:t>Refactored legacy .NET stored procedures and wrote automated regression tests using Selenium &amp; Playwright across core SaaS modules.</w:t>
+        <w:t>Refactored legacy stored procedures and wrote regression tests in Selenium and Playwright for core SaaS modules.</w:t>
       </w:r>
     </w:p>
     <w:p>
@@ -600,7 +600,85 @@
           <w:color w:val="1E293B"/>
           <w:sz w:val="17"/>
         </w:rPr>
-        <w:t>Led SonarQube static code analysis across enterprise repositories, fixed security vulnerabilities, configured CI/CD quality gates, and enforced zero-vulnerability deployment standards.</w:t>
+        <w:t>Led the SonarQube rollout across enterprise repositories, fixed the security vulnerabilities it flagged, and set CI/CD quality gates that block deployments with new vulnerabilities.</w:t>
+      </w:r>
+    </w:p>
+    <w:p>
+      <w:pPr>
+        <w:keepNext/>
+        <w:spacing w:before="60" w:after="20"/>
+      </w:pPr>
+      <w:r>
+        <w:rPr>
+          <w:rFonts w:ascii="Calibri" w:hAnsi="Calibri"/>
+          <w:b/>
+          <w:color w:val="0F172A"/>
+          <w:sz w:val="18"/>
+        </w:rPr>
+        <w:t xml:space="preserve">Freelance Fullstack &amp; AI Engineer | </w:t>
+      </w:r>
+      <w:r>
+        <w:rPr>
+          <w:rFonts w:ascii="Calibri" w:hAnsi="Calibri"/>
+          <w:b/>
+          <w:color w:val="0F172A"/>
+          <w:sz w:val="18"/>
+        </w:rPr>
+        <w:t>Self-employed</w:t>
+      </w:r>
+      <w:r>
+        <w:rPr>
+          <w:rFonts w:ascii="Calibri" w:hAnsi="Calibri"/>
+          <w:color w:val="475569"/>
+          <w:sz w:val="17"/>
+        </w:rPr>
+        <w:t xml:space="preserve"> (Surabaya, Remote) | 2021 - Present</w:t>
+      </w:r>
+    </w:p>
+    <w:p>
+      <w:pPr>
+        <w:spacing w:after="20"/>
+        <w:ind w:left="259"/>
+      </w:pPr>
+      <w:r>
+        <w:rPr>
+          <w:rFonts w:ascii="Calibri" w:hAnsi="Calibri"/>
+          <w:b/>
+          <w:color w:val="0F172A"/>
+          <w:sz w:val="17"/>
+        </w:rPr>
+        <w:t xml:space="preserve">•  </w:t>
+      </w:r>
+      <w:r>
+        <w:rPr>
+          <w:rFonts w:ascii="Calibri" w:hAnsi="Calibri"/>
+          <w:color w:val="1E293B"/>
+          <w:sz w:val="17"/>
+        </w:rPr>
+        <w:t>Build AI products end to end, from architecture to production: Qualiv, an AI recruitment SaaS, and an AI tire-recommendation assistant for PT Nagamasban.</w:t>
+      </w:r>
+    </w:p>
+    <w:p>
+      <w:pPr>
+        <w:spacing w:after="20"/>
+        <w:ind w:left="259"/>
+      </w:pPr>
+      <w:r>
+        <w:rPr>
+          <w:rFonts w:ascii="Calibri" w:hAnsi="Calibri"/>
+          <w:b/>
+          <w:color w:val="0F172A"/>
+          <w:sz w:val="17"/>
+        </w:rPr>
+        <w:t xml:space="preserve">•  </w:t>
+      </w:r>
+      <w:r>
+        <w:rPr>
+          <w:rFonts w:ascii="Calibri" w:hAnsi="Calibri"/>
+          <w:color w:val="1E293B"/>
+          <w:sz w:val="17"/>
+        </w:rPr>
+        <w:t>Deliver client systems: the Wonderful Works website and CMS, and Laravel ERP/POS systems for tire, jewelry (RFID), yarn, and grocery retailers.</w:t>
       </w:r>
     </w:p>
     <w:p>
@@ -655,7 +733,7 @@
           <w:color w:val="1E293B"/>
           <w:sz w:val="17"/>
         </w:rPr>
-        <w:t>Built high-performance web applications using Node.js and Next.js, optimizing complex SQL queries for high-concurrency transactions.</w:t>
+        <w:t>Maintained a legacy enterprise Tool Management System (TMS) in Java, Spring Boot, and Oracle. Led a Java version upgrade, a large refactor, and a code-review process, and optimized complex SQL queries.</w:t>
       </w:r>
     </w:p>
     <w:p>
@@ -678,7 +756,7 @@
           <w:color w:val="1E293B"/>
           <w:sz w:val="17"/>
         </w:rPr>
-        <w:t>Recovered and repaired 10,000+ corrupted database records by identifying and patching edge-case business logic bugs.</w:t>
+        <w:t>Tracked down the edge-case business-logic bugs that were corrupting data, patched them, and repaired 10,000+ corrupted records.</w:t>
       </w:r>
     </w:p>
     <w:p>
@@ -701,7 +779,7 @@
           <w:color w:val="1E293B"/>
           <w:sz w:val="17"/>
         </w:rPr>
-        <w:t>Maintained self-hosted Git servers, configured Elasticsearch clusters for log indexing, and upgraded enterprise Java runtimes.</w:t>
+        <w:t>Maintained self-hosted Git servers and set up Elasticsearch clusters for log indexing.</w:t>
       </w:r>
     </w:p>
     <w:p>
@@ -724,7 +802,7 @@
           <w:color w:val="1E293B"/>
           <w:sz w:val="17"/>
         </w:rPr>
-        <w:t>Resolved recurring high-priority incidents by diagnosing and fixing core backend bottlenecks.</w:t>
+        <w:t>Traced recurring high-priority incidents to backend bottlenecks and fixed them, cutting incident tickets quarter over quarter.</w:t>
       </w:r>
     </w:p>
     <w:p>
@@ -782,7 +860,7 @@
           <w:color w:val="1E293B"/>
           <w:sz w:val="17"/>
         </w:rPr>
-        <w:t>Developed manufacturing dashboards and reporting systems for pulp &amp; paper production using .NET Core, C#, ASP Classic, and SQL Server.</w:t>
+        <w:t>Built manufacturing dashboards and reports for pulp &amp; paper production in .NET Core, C#, ASP Classic, and SQL Server. Query tuning cut long-running reports from minutes to seconds.</w:t>
       </w:r>
     </w:p>
     <w:p>
@@ -805,7 +883,7 @@
           <w:color w:val="1E293B"/>
           <w:sz w:val="17"/>
         </w:rPr>
-        <w:t>Built an automated WhatsApp alert bot using Python, Java, and Selenium, capturing real-time production metrics for plant OEE and HWT targets.</w:t>
+        <w:t>Automated plant reporting with a WhatsApp bot (Python, Java, Selenium) that sends scheduled dashboard snapshots of OEE and HWT production metrics.</w:t>
       </w:r>
     </w:p>
     <w:p>
@@ -828,7 +906,7 @@
           <w:color w:val="1E293B"/>
           <w:sz w:val="17"/>
         </w:rPr>
-        <w:t>Designed and deployed a native Android Barcode Scanner application for warehouse inventory tracking.</w:t>
+        <w:t>Shipped a native Android barcode scanner app for warehouse stock-in and stock-out.</w:t>
       </w:r>
     </w:p>
     <w:p>
@@ -851,7 +929,7 @@
           <w:color w:val="1E293B"/>
           <w:sz w:val="17"/>
         </w:rPr>
-        <w:t>Delivered enterprise internal applications including an automated COVID-19 employee health check-in platform and digital corporate raffle draw systems.</w:t>
+        <w:t>Developed internal apps, including a company-wide daily COVID-19 health check-in and a digital company raffle draw.</w:t>
       </w:r>
     </w:p>
     <w:p>
@@ -869,7 +947,7 @@
           <w:color w:val="0F172A"/>
           <w:sz w:val="19"/>
         </w:rPr>
-        <w:t>FEATURED PROJECTS &amp; INNOVATIONS</w:t>
+        <w:t>FEATURED PROJECTS</w:t>
       </w:r>
     </w:p>
     <w:p>
@@ -913,7 +991,7 @@
           <w:color w:val="1E293B"/>
           <w:sz w:val="17"/>
         </w:rPr>
-        <w:t xml:space="preserve">Built a multi-tenant AI recruitment SaaS featuring automated CV parsing (PDF/DOCX), candidate logic testing, async video interviews, and candidate scoring engine. </w:t>
+        <w:t xml:space="preserve">Multi-tenant recruitment SaaS, built from scratch. It parses CVs (PDF/DOCX), runs logic tests and async video interviews, and scores each candidate against the job's requirements. </w:t>
       </w:r>
       <w:r>
         <w:rPr>
@@ -956,7 +1034,7 @@
             <w:sz w:val="17"/>
             <w:rFonts w:ascii="Calibri" w:hAnsi="Calibri"/>
           </w:rPr>
-          <w:t>OpenClaw | AI VPS Security &amp; Ops Agent</w:t>
+          <w:t>PT Nagamasban | AI Sales Assistant &amp; Catalog</w:t>
         </w:r>
       </w:hyperlink>
       <w:r>
@@ -966,7 +1044,7 @@
           <w:color w:val="0F172A"/>
           <w:sz w:val="17"/>
         </w:rPr>
-        <w:t xml:space="preserve"> (Autonomous AI Agent): </w:t>
+        <w:t xml:space="preserve"> (Lead AI Architect): </w:t>
       </w:r>
       <w:r>
         <w:rPr>
@@ -974,7 +1052,7 @@
           <w:color w:val="1E293B"/>
           <w:sz w:val="17"/>
         </w:rPr>
-        <w:t xml:space="preserve">Linux VPS monitoring and security agent featuring LLM log anomaly diagnosis, real-time SSH brute-force detection, Fail2ban auto-mitigation, and Telegram alerts. </w:t>
+        <w:t xml:space="preserve">Recommendation and sales-training tool for a Surabaya tire distributor. Matches tires to a customer's vehicle and budget using OpenAI embeddings and semantic search. </w:t>
       </w:r>
       <w:r>
         <w:rPr>
@@ -991,7 +1069,7 @@
           <w:color w:val="475569"/>
           <w:sz w:val="16"/>
         </w:rPr>
-        <w:t>Node.js, OpenAI API, Telegram Bot API, Fail2ban, Docker, Linux Security</w:t>
+        <w:t>Next.js, NestJS, OpenAI Embeddings, Semantic Search, Tailwind CSS</w:t>
       </w:r>
     </w:p>
     <w:p>
@@ -1017,7 +1095,7 @@
             <w:sz w:val="17"/>
             <w:rFonts w:ascii="Calibri" w:hAnsi="Calibri"/>
           </w:rPr>
-          <w:t>PT Nagamasban | AI Sales Assistant &amp; Catalog</w:t>
+          <w:t>Wonderful Works | Architecture &amp; Contractor Platform</w:t>
         </w:r>
       </w:hyperlink>
       <w:r>
@@ -1027,7 +1105,7 @@
           <w:color w:val="0F172A"/>
           <w:sz w:val="17"/>
         </w:rPr>
-        <w:t xml:space="preserve"> (Lead AI Architect): </w:t>
+        <w:t xml:space="preserve"> (Fullstack Architect): </w:t>
       </w:r>
       <w:r>
         <w:rPr>
@@ -1035,7 +1113,7 @@
           <w:color w:val="1E293B"/>
           <w:sz w:val="17"/>
         </w:rPr>
-        <w:t xml:space="preserve">AI recommendation engine and sales training tool for a Surabaya tire distributor. Matches tire specifications with vehicle models and customer budgets using OpenAI GPT-4o embeddings and semantic search. </w:t>
+        <w:t xml:space="preserve">Company website and CMS for a Surabaya architecture and contracting firm. Staff can edit pages in a drag-and-drop composer and manage bilingual (ID/EN) content, project photos, and users from an admin panel with JWT auth. JSON-LD for SEO; deploys through Docker and Jenkins. </w:t>
       </w:r>
       <w:r>
         <w:rPr>
@@ -1052,68 +1130,7 @@
           <w:color w:val="475569"/>
           <w:sz w:val="16"/>
         </w:rPr>
-        <w:t>Next.js, NestJS, OpenAI API, Vector Embeddings, Tailwind CSS</w:t>
-      </w:r>
-    </w:p>
-    <w:p>
-      <w:pPr>
-        <w:spacing w:after="40"/>
-        <w:ind w:left="259"/>
-      </w:pPr>
-      <w:r>
-        <w:rPr>
-          <w:rFonts w:ascii="Calibri" w:hAnsi="Calibri"/>
-          <w:b/>
-          <w:color w:val="0F172A"/>
-          <w:sz w:val="17"/>
-        </w:rPr>
-        <w:t xml:space="preserve">•  </w:t>
-      </w:r>
-      <w:hyperlink r:id="rId11" w:history="1">
-        <w:r>
-          <w:rPr>
-            <w:color w:val="0F172A"/>
-            <w:u w:val="single"/>
-            <w:b/>
-            <w:sz w:val="17"/>
-            <w:rFonts w:ascii="Calibri" w:hAnsi="Calibri"/>
-          </w:rPr>
-          <w:t>AI Portfolio Assistant &amp; Interactive Chatbot</w:t>
-        </w:r>
-      </w:hyperlink>
-      <w:r>
-        <w:rPr>
-          <w:rFonts w:ascii="Calibri" w:hAnsi="Calibri"/>
-          <w:b/>
-          <w:color w:val="0F172A"/>
-          <w:sz w:val="17"/>
-        </w:rPr>
-        <w:t xml:space="preserve"> (Creator): </w:t>
-      </w:r>
-      <w:r>
-        <w:rPr>
-          <w:rFonts w:ascii="Calibri" w:hAnsi="Calibri"/>
-          <w:color w:val="1E293B"/>
-          <w:sz w:val="17"/>
-        </w:rPr>
-        <w:t xml:space="preserve">RAG-powered portfolio chatbot allowing recruiters and visitors to query professional background, tech stack, and system architecture in real time. </w:t>
-      </w:r>
-      <w:r>
-        <w:rPr>
-          <w:rFonts w:ascii="Calibri" w:hAnsi="Calibri"/>
-          <w:b/>
-          <w:color w:val="0F172A"/>
-          <w:sz w:val="16"/>
-        </w:rPr>
-        <w:t xml:space="preserve">Tech Stack: </w:t>
-      </w:r>
-      <w:r>
-        <w:rPr>
-          <w:rFonts w:ascii="Calibri" w:hAnsi="Calibri"/>
-          <w:color w:val="475569"/>
-          <w:sz w:val="16"/>
-        </w:rPr>
-        <w:t>Next.js, OpenAI API, Vector Embeddings, Tailwind CSS</w:t>
+        <w:t>Next.js 16, React 19, Tailwind CSS v4, Prisma, PostgreSQL, Puck Visual Editor, Docker, Jenkins</w:t>
       </w:r>
     </w:p>
     <w:p>
@@ -1139,7 +1156,7 @@
             <w:sz w:val="17"/>
             <w:rFonts w:ascii="Calibri" w:hAnsi="Calibri"/>
           </w:rPr>
-          <w:t>Retail &amp; Enterprise Custom ERP / POS Systems</w:t>
+          <w:t>Retail ERP &amp; POS Systems</w:t>
         </w:r>
       </w:hyperlink>
       <w:r>
@@ -1157,7 +1174,7 @@
           <w:color w:val="1E293B"/>
           <w:sz w:val="17"/>
         </w:rPr>
-        <w:t xml:space="preserve">Delivered custom solutions for retail enterprises: (1) Cahaya Terang Tire ERP (Double-entry A/R &amp; A/P Ledger), (2) Wijaya Mas Jewelry POS (RFID Hardware integration), (3) Knit and Cro E-Commerce (Midtrans &amp; RajaOngkir API), and (4) Tiga Putra Grocery POS (FIFO Expiry tracking). </w:t>
+        <w:t xml:space="preserve">Custom systems for four retail businesses: Cahaya Terang Tire ERP (double-entry A/R and A/P ledger), Wijaya Mas Jewelry POS (RFID stock tagging), Knit and Cro e-commerce (Midtrans, RajaOngkir), and Tiga Putra Grocery POS (FIFO expiry tracking). </w:t>
       </w:r>
       <w:r>
         <w:rPr>
@@ -1175,64 +1192,6 @@
           <w:sz w:val="16"/>
         </w:rPr>
         <w:t>Laravel, Livewire, MySQL, RFID Integration, Payment Gateway</w:t>
-      </w:r>
-    </w:p>
-    <w:p>
-      <w:pPr>
-        <w:spacing w:after="40"/>
-        <w:ind w:left="259"/>
-      </w:pPr>
-      <w:r>
-        <w:rPr>
-          <w:rFonts w:ascii="Calibri" w:hAnsi="Calibri"/>
-          <w:b/>
-          <w:color w:val="0F172A"/>
-          <w:sz w:val="17"/>
-        </w:rPr>
-        <w:t xml:space="preserve">•  </w:t>
-      </w:r>
-      <w:r>
-        <w:rPr>
-          <w:rFonts w:ascii="Calibri" w:hAnsi="Calibri"/>
-          <w:b/>
-          <w:color w:val="0F172A"/>
-          <w:sz w:val="17"/>
-        </w:rPr>
-        <w:t>CG Home Sharing &amp; Interactive Quiz Platforms</w:t>
-      </w:r>
-      <w:r>
-        <w:rPr>
-          <w:rFonts w:ascii="Calibri" w:hAnsi="Calibri"/>
-          <w:b/>
-          <w:color w:val="0F172A"/>
-          <w:sz w:val="17"/>
-        </w:rPr>
-        <w:t xml:space="preserve"> (Community Initiative Lead): </w:t>
-      </w:r>
-      <w:r>
-        <w:rPr>
-          <w:rFonts w:ascii="Calibri" w:hAnsi="Calibri"/>
-          <w:color w:val="1E293B"/>
-          <w:sz w:val="17"/>
-        </w:rPr>
-        <w:t xml:space="preserve">Built community platforms including an Airbnb-style room booking system with Leaflet GIS maps and surveyor inspection workflows, and a real-time WebSocket online quiz and logic testing platform. </w:t>
-      </w:r>
-      <w:r>
-        <w:rPr>
-          <w:rFonts w:ascii="Calibri" w:hAnsi="Calibri"/>
-          <w:b/>
-          <w:color w:val="0F172A"/>
-          <w:sz w:val="16"/>
-        </w:rPr>
-        <w:t xml:space="preserve">Tech Stack: </w:t>
-      </w:r>
-      <w:r>
-        <w:rPr>
-          <w:rFonts w:ascii="Calibri" w:hAnsi="Calibri"/>
-          <w:color w:val="475569"/>
-          <w:sz w:val="16"/>
-        </w:rPr>
-        <w:t>Next.js, NestJS, PostgreSQL, Prisma, Leaflet GIS, WebSockets</w:t>
       </w:r>
     </w:p>
     <w:p>
@@ -1572,7 +1531,7 @@
           <w:color w:val="1E293B"/>
           <w:sz w:val="17"/>
         </w:rPr>
-        <w:t>, 2026). Hands-on implementation of autonomous agent architecture, tool use, and MCP server-client protocols.</w:t>
+        <w:t>, 2026). Hands-on course covering agent design, tool use, and building MCP servers and clients.</w:t>
       </w:r>
     </w:p>
     <w:p>
@@ -1645,7 +1604,7 @@
           <w:color w:val="1E293B"/>
           <w:sz w:val="17"/>
         </w:rPr>
-        <w:t>, 2026). High-throughput distributed systems, microservices design, caching strategies, and fault-tolerant architecture.</w:t>
+        <w:t>, 2026). Covers microservices, caching, and fault-tolerant design for high-throughput systems.</w:t>
       </w:r>
     </w:p>
     <w:p>

</xml_diff>

<commit_message>
docs: separate POS systems from Knit and Cro online shop
- CV: split "Retail ERP & POS Systems" into a dedicated Retail POS &
  Inventory Systems entry (four stores) and a Knit and Cro online shop entry
- CV: mention Midtrans subscription billing for Qualiv
- About: freelance copy leads with POS and inventory systems for retail
  stores, with the online shop and Wonderful Works listed separately

Co-Authored-By: Claude Opus 5.5 <noreply@anthropic.com>
</commit_message>
<xml_diff>
--- a/public/Andry_Huang_CV.docx
+++ b/public/Andry_Huang_CV.docx
@@ -678,7 +678,7 @@
           <w:color w:val="1E293B"/>
           <w:sz w:val="17"/>
         </w:rPr>
-        <w:t>Deliver client systems: the Wonderful Works website and CMS, and Laravel ERP/POS systems for tire, jewelry (RFID), yarn, and grocery retailers.</w:t>
+        <w:t>Build POS and inventory systems for retail stores (yarn, RFID jewelry, grocery, tire), plus the Knit and Cro online shop and the Wonderful Works website and CMS.</w:t>
       </w:r>
     </w:p>
     <w:p>
@@ -991,7 +991,7 @@
           <w:color w:val="1E293B"/>
           <w:sz w:val="17"/>
         </w:rPr>
-        <w:t xml:space="preserve">Multi-tenant recruitment SaaS, built from scratch. It parses CVs (PDF/DOCX), runs logic tests and async video interviews, and scores each candidate against the job's requirements. </w:t>
+        <w:t xml:space="preserve">Multi-tenant recruitment SaaS, built from scratch. It parses CVs (PDF/DOCX), runs logic tests and async video interviews, and scores each candidate against the job's requirements. Companies pay for subscriptions through Midtrans. </w:t>
       </w:r>
       <w:r>
         <w:rPr>
@@ -1086,6 +1086,64 @@
         </w:rPr>
         <w:t xml:space="preserve">•  </w:t>
       </w:r>
+      <w:r>
+        <w:rPr>
+          <w:rFonts w:ascii="Calibri" w:hAnsi="Calibri"/>
+          <w:b/>
+          <w:color w:val="0F172A"/>
+          <w:sz w:val="17"/>
+        </w:rPr>
+        <w:t>Retail POS &amp; Inventory Systems</w:t>
+      </w:r>
+      <w:r>
+        <w:rPr>
+          <w:rFonts w:ascii="Calibri" w:hAnsi="Calibri"/>
+          <w:b/>
+          <w:color w:val="0F172A"/>
+          <w:sz w:val="17"/>
+        </w:rPr>
+        <w:t xml:space="preserve"> (Fullstack Architect): </w:t>
+      </w:r>
+      <w:r>
+        <w:rPr>
+          <w:rFonts w:ascii="Calibri" w:hAnsi="Calibri"/>
+          <w:color w:val="1E293B"/>
+          <w:sz w:val="17"/>
+        </w:rPr>
+        <w:t xml:space="preserve">POS and inventory systems for four stores: Knit and Cro Pluit yarn store (color and dye-lot variants, stock opname, role-based access), Wijaya Mas jewelry store (RFID tagging, daily gold-price calculation, buyback), Tiga Putra grocery (PO/SO, FIFO expiry tracking), and Cahaya Terang tire shop (sales and purchasing with a double-entry A/R and A/P ledger). </w:t>
+      </w:r>
+      <w:r>
+        <w:rPr>
+          <w:rFonts w:ascii="Calibri" w:hAnsi="Calibri"/>
+          <w:b/>
+          <w:color w:val="0F172A"/>
+          <w:sz w:val="16"/>
+        </w:rPr>
+        <w:t xml:space="preserve">Tech Stack: </w:t>
+      </w:r>
+      <w:r>
+        <w:rPr>
+          <w:rFonts w:ascii="Calibri" w:hAnsi="Calibri"/>
+          <w:color w:val="475569"/>
+          <w:sz w:val="16"/>
+        </w:rPr>
+        <w:t>Laravel 11, Livewire 3, MySQL 8, Alpine.js, RFID Hardware, RBAC</w:t>
+      </w:r>
+    </w:p>
+    <w:p>
+      <w:pPr>
+        <w:spacing w:after="40"/>
+        <w:ind w:left="259"/>
+      </w:pPr>
+      <w:r>
+        <w:rPr>
+          <w:rFonts w:ascii="Calibri" w:hAnsi="Calibri"/>
+          <w:b/>
+          <w:color w:val="0F172A"/>
+          <w:sz w:val="17"/>
+        </w:rPr>
+        <w:t xml:space="preserve">•  </w:t>
+      </w:r>
       <w:hyperlink r:id="rId18" w:history="1">
         <w:r>
           <w:rPr>
@@ -1156,7 +1214,7 @@
             <w:sz w:val="17"/>
             <w:rFonts w:ascii="Calibri" w:hAnsi="Calibri"/>
           </w:rPr>
-          <w:t>Retail ERP &amp; POS Systems</w:t>
+          <w:t>Knit and Cro | Online Shop</w:t>
         </w:r>
       </w:hyperlink>
       <w:r>
@@ -1174,7 +1232,7 @@
           <w:color w:val="1E293B"/>
           <w:sz w:val="17"/>
         </w:rPr>
-        <w:t xml:space="preserve">Custom systems for four retail businesses: Cahaya Terang Tire ERP (double-entry A/R and A/P ledger), Wijaya Mas Jewelry POS (RFID stock tagging), Knit and Cro e-commerce (Midtrans, RajaOngkir), and Tiga Putra Grocery POS (FIFO expiry tracking). </w:t>
+        <w:t xml:space="preserve">Online shop for a yarn store in Pluit, Jakarta, connected to the store's inventory. Customers pay through Midtrans (QRIS, bank transfer, e-wallet) and get shipping rates from RajaOngkir; staff handle orders, tracking numbers, and returns from an admin dashboard. </w:t>
       </w:r>
       <w:r>
         <w:rPr>
@@ -1191,7 +1249,7 @@
           <w:color w:val="475569"/>
           <w:sz w:val="16"/>
         </w:rPr>
-        <w:t>Laravel, Livewire, MySQL, RFID Integration, Payment Gateway</w:t>
+        <w:t>Laravel 11, Livewire 3, MySQL 8, Midtrans, RajaOngkir API, Tailwind CSS</w:t>
       </w:r>
     </w:p>
     <w:p>

</xml_diff>

<commit_message>
feat: rename archive to portfolio and update works cta
</commit_message>
<xml_diff>
--- a/public/Andry_Huang_CV.docx
+++ b/public/Andry_Huang_CV.docx
@@ -278,7 +278,7 @@
           <w:color w:val="1E293B"/>
           <w:sz w:val="17"/>
         </w:rPr>
-        <w:t>RAG Architecture, OpenAI GPT-4o, Anthropic Claude API, Model Context Protocol (MCP), Autonomous AI Agents, pgvector, BullMQ, Prompt Engineering</w:t>
+        <w:t>RAG Architecture, OpenAI GPT-4o, Google Gemini API, Voice AI (STT/TTS), Anthropic Claude API, Model Context Protocol (MCP), Autonomous AI Agents, pgvector, BullMQ, Prompt Engineering</w:t>
       </w:r>
     </w:p>
     <w:p>
@@ -991,7 +991,7 @@
           <w:color w:val="1E293B"/>
           <w:sz w:val="17"/>
         </w:rPr>
-        <w:t xml:space="preserve">Multi-tenant recruitment SaaS, built from scratch. It parses CVs (PDF/DOCX), runs logic tests and async video interviews, and scores each candidate against the job's requirements. Companies pay for subscriptions through Midtrans. </w:t>
+        <w:t xml:space="preserve">Multi-tenant recruitment SaaS, built from scratch. It parses CVs (PDF/DOCX), runs AI chat interviews, logic tests, and spoken video interviews in Indonesian, and scores each candidate against the job's requirements. In the video interview, Gemini transcribes each spoken answer and writes the next question, and OpenAI text-to-speech reads it aloud over a WebSocket. Companies pay for subscriptions through Midtrans. </w:t>
       </w:r>
       <w:r>
         <w:rPr>
@@ -1008,7 +1008,7 @@
           <w:color w:val="475569"/>
           <w:sz w:val="16"/>
         </w:rPr>
-        <w:t>Next.js, NestJS, OpenAI GPT-4o, PostgreSQL, Prisma, BullMQ, Redis Queue, Cloudflare R2, Midtrans</w:t>
+        <w:t>Next.js, NestJS, OpenAI GPT-4o, Google Gemini, Speech-to-Text &amp; TTS, Socket.IO, PostgreSQL, Prisma, BullMQ, Redis Queue, Cloudflare R2, Midtrans</w:t>
       </w:r>
     </w:p>
     <w:p>

</xml_diff>